<commit_message>
Added EfficentNet and UNet
</commit_message>
<xml_diff>
--- a/ImagePreprocessing.docx
+++ b/ImagePreprocessing.docx
@@ -20282,13 +20282,7 @@
         <w:rPr>
           <w:rFonts w:ascii="Times New Roman" w:eastAsia="Times New Roman" w:hAnsi="Times New Roman" w:cs="Times New Roman"/>
         </w:rPr>
-        <w:t xml:space="preserve"> </w:t>
-      </w:r>
-      <w:r>
-        <w:rPr>
-          <w:rFonts w:ascii="Times New Roman" w:eastAsia="Times New Roman" w:hAnsi="Times New Roman" w:cs="Times New Roman"/>
-        </w:rPr>
-        <w:t xml:space="preserve">138M </w:t>
+        <w:t xml:space="preserve"> 138M </w:t>
       </w:r>
       <w:proofErr w:type="spellStart"/>
       <w:r>
@@ -20397,147 +20391,7 @@
         <w:rPr>
           <w:rFonts w:ascii="Times New Roman" w:eastAsia="Times New Roman" w:hAnsi="Times New Roman" w:cs="Times New Roman"/>
         </w:rPr>
-        <w:t xml:space="preserve">Uvode </w:t>
-      </w:r>
-      <w:proofErr w:type="spellStart"/>
-      <w:r>
-        <w:rPr>
-          <w:rFonts w:ascii="Times New Roman" w:eastAsia="Times New Roman" w:hAnsi="Times New Roman" w:cs="Times New Roman"/>
-        </w:rPr>
-        <w:t>rezidualnu</w:t>
-      </w:r>
-      <w:proofErr w:type="spellEnd"/>
-      <w:r>
-        <w:rPr>
-          <w:rFonts w:ascii="Times New Roman" w:eastAsia="Times New Roman" w:hAnsi="Times New Roman" w:cs="Times New Roman"/>
-        </w:rPr>
-        <w:t xml:space="preserve"> </w:t>
-      </w:r>
-      <w:proofErr w:type="spellStart"/>
-      <w:r>
-        <w:rPr>
-          <w:rFonts w:ascii="Times New Roman" w:eastAsia="Times New Roman" w:hAnsi="Times New Roman" w:cs="Times New Roman"/>
-        </w:rPr>
-        <w:t>konekciju</w:t>
-      </w:r>
-      <w:proofErr w:type="spellEnd"/>
-      <w:r>
-        <w:rPr>
-          <w:rFonts w:ascii="Times New Roman" w:eastAsia="Times New Roman" w:hAnsi="Times New Roman" w:cs="Times New Roman"/>
-        </w:rPr>
-        <w:t xml:space="preserve"> (skip connection) </w:t>
-      </w:r>
-      <w:proofErr w:type="spellStart"/>
-      <w:r>
-        <w:rPr>
-          <w:rFonts w:ascii="Times New Roman" w:eastAsia="Times New Roman" w:hAnsi="Times New Roman" w:cs="Times New Roman"/>
-        </w:rPr>
-        <w:t>koja</w:t>
-      </w:r>
-      <w:proofErr w:type="spellEnd"/>
-      <w:r>
-        <w:rPr>
-          <w:rFonts w:ascii="Times New Roman" w:eastAsia="Times New Roman" w:hAnsi="Times New Roman" w:cs="Times New Roman"/>
-        </w:rPr>
-        <w:t xml:space="preserve"> </w:t>
-      </w:r>
-      <w:proofErr w:type="spellStart"/>
-      <w:r>
-        <w:rPr>
-          <w:rFonts w:ascii="Times New Roman" w:eastAsia="Times New Roman" w:hAnsi="Times New Roman" w:cs="Times New Roman"/>
-        </w:rPr>
-        <w:t>omogućava</w:t>
-      </w:r>
-      <w:proofErr w:type="spellEnd"/>
-      <w:r>
-        <w:rPr>
-          <w:rFonts w:ascii="Times New Roman" w:eastAsia="Times New Roman" w:hAnsi="Times New Roman" w:cs="Times New Roman"/>
-        </w:rPr>
-        <w:t xml:space="preserve"> </w:t>
-      </w:r>
-      <w:proofErr w:type="spellStart"/>
-      <w:r>
-        <w:rPr>
-          <w:rFonts w:ascii="Times New Roman" w:eastAsia="Times New Roman" w:hAnsi="Times New Roman" w:cs="Times New Roman"/>
-        </w:rPr>
-        <w:t>treniranje</w:t>
-      </w:r>
-      <w:proofErr w:type="spellEnd"/>
-      <w:r>
-        <w:rPr>
-          <w:rFonts w:ascii="Times New Roman" w:eastAsia="Times New Roman" w:hAnsi="Times New Roman" w:cs="Times New Roman"/>
-        </w:rPr>
-        <w:t xml:space="preserve"> </w:t>
-      </w:r>
-      <w:proofErr w:type="spellStart"/>
-      <w:r>
-        <w:rPr>
-          <w:rFonts w:ascii="Times New Roman" w:eastAsia="Times New Roman" w:hAnsi="Times New Roman" w:cs="Times New Roman"/>
-        </w:rPr>
-        <w:t>znatno</w:t>
-      </w:r>
-      <w:proofErr w:type="spellEnd"/>
-      <w:r>
-        <w:rPr>
-          <w:rFonts w:ascii="Times New Roman" w:eastAsia="Times New Roman" w:hAnsi="Times New Roman" w:cs="Times New Roman"/>
-        </w:rPr>
-        <w:t xml:space="preserve"> </w:t>
-      </w:r>
-      <w:proofErr w:type="spellStart"/>
-      <w:r>
-        <w:rPr>
-          <w:rFonts w:ascii="Times New Roman" w:eastAsia="Times New Roman" w:hAnsi="Times New Roman" w:cs="Times New Roman"/>
-        </w:rPr>
-        <w:t>dubljih</w:t>
-      </w:r>
-      <w:proofErr w:type="spellEnd"/>
-      <w:r>
-        <w:rPr>
-          <w:rFonts w:ascii="Times New Roman" w:eastAsia="Times New Roman" w:hAnsi="Times New Roman" w:cs="Times New Roman"/>
-        </w:rPr>
-        <w:t xml:space="preserve"> </w:t>
-      </w:r>
-      <w:proofErr w:type="spellStart"/>
-      <w:r>
-        <w:rPr>
-          <w:rFonts w:ascii="Times New Roman" w:eastAsia="Times New Roman" w:hAnsi="Times New Roman" w:cs="Times New Roman"/>
-        </w:rPr>
-        <w:t>mreža</w:t>
-      </w:r>
-      <w:proofErr w:type="spellEnd"/>
-      <w:r>
-        <w:rPr>
-          <w:rFonts w:ascii="Times New Roman" w:eastAsia="Times New Roman" w:hAnsi="Times New Roman" w:cs="Times New Roman"/>
-        </w:rPr>
-        <w:t xml:space="preserve"> bez </w:t>
-      </w:r>
-      <w:proofErr w:type="spellStart"/>
-      <w:r>
-        <w:rPr>
-          <w:rFonts w:ascii="Times New Roman" w:eastAsia="Times New Roman" w:hAnsi="Times New Roman" w:cs="Times New Roman"/>
-        </w:rPr>
-        <w:t>degradacionog</w:t>
-      </w:r>
-      <w:proofErr w:type="spellEnd"/>
-      <w:r>
-        <w:rPr>
-          <w:rFonts w:ascii="Times New Roman" w:eastAsia="Times New Roman" w:hAnsi="Times New Roman" w:cs="Times New Roman"/>
-        </w:rPr>
-        <w:t xml:space="preserve"> </w:t>
-      </w:r>
-      <w:proofErr w:type="spellStart"/>
-      <w:r>
-        <w:rPr>
-          <w:rFonts w:ascii="Times New Roman" w:eastAsia="Times New Roman" w:hAnsi="Times New Roman" w:cs="Times New Roman"/>
-        </w:rPr>
-        <w:t>problema</w:t>
-      </w:r>
-      <w:proofErr w:type="spellEnd"/>
-      <w:r>
-        <w:rPr>
-          <w:rFonts w:ascii="Times New Roman" w:eastAsia="Times New Roman" w:hAnsi="Times New Roman" w:cs="Times New Roman"/>
-        </w:rPr>
-        <w:t>. ResNet50 (</w:t>
+        <w:t>Uvode rezidualnu konekciju (skip connection) koja omogućava treniranje znatno dubljih mreža bez degradacionog problema. ResNet50 (</w:t>
       </w:r>
       <w:r>
         <w:rPr>
@@ -21580,23 +21434,7 @@
           <w:sz w:val="24"/>
           <w:szCs w:val="24"/>
         </w:rPr>
-        <w:t>U nastavku je dat pregled ključnih studija koje su koristile HAM10000 sa različitim pipelin</w:t>
-      </w:r>
-      <w:r>
-        <w:rPr>
-          <w:rFonts w:ascii="Times New Roman" w:eastAsia="Times New Roman" w:hAnsi="Times New Roman" w:cs="Times New Roman"/>
-          <w:sz w:val="24"/>
-          <w:szCs w:val="24"/>
-        </w:rPr>
-        <w:t>e-ov</w:t>
-      </w:r>
-      <w:r>
-        <w:rPr>
-          <w:rFonts w:ascii="Times New Roman" w:eastAsia="Times New Roman" w:hAnsi="Times New Roman" w:cs="Times New Roman"/>
-          <w:sz w:val="24"/>
-          <w:szCs w:val="24"/>
-        </w:rPr>
-        <w:t>ima predobrade, zajedno sa postignutim performansama.</w:t>
+        <w:t>U nastavku je dat pregled ključnih studija koje su koristile HAM10000 sa različitim pipeline-ovima predobrade, zajedno sa postignutim performansama.</w:t>
       </w:r>
     </w:p>
     <w:tbl>
@@ -21624,12 +21462,6 @@
         <w:gridCol w:w="1850"/>
       </w:tblGrid>
       <w:tr>
-        <w:tblPrEx>
-          <w:tblCellMar>
-            <w:top w:w="0" w:type="dxa"/>
-            <w:bottom w:w="0" w:type="dxa"/>
-          </w:tblCellMar>
-        </w:tblPrEx>
         <w:tc>
           <w:tcPr>
             <w:tcW w:w="1893" w:type="dxa"/>
@@ -21807,12 +21639,6 @@
         </w:tc>
       </w:tr>
       <w:tr>
-        <w:tblPrEx>
-          <w:tblCellMar>
-            <w:top w:w="0" w:type="dxa"/>
-            <w:bottom w:w="0" w:type="dxa"/>
-          </w:tblCellMar>
-        </w:tblPrEx>
         <w:tc>
           <w:tcPr>
             <w:tcW w:w="1893" w:type="dxa"/>
@@ -21975,12 +21801,6 @@
         </w:tc>
       </w:tr>
       <w:tr>
-        <w:tblPrEx>
-          <w:tblCellMar>
-            <w:top w:w="0" w:type="dxa"/>
-            <w:bottom w:w="0" w:type="dxa"/>
-          </w:tblCellMar>
-        </w:tblPrEx>
         <w:tc>
           <w:tcPr>
             <w:tcW w:w="1893" w:type="dxa"/>
@@ -22143,12 +21963,6 @@
         </w:tc>
       </w:tr>
       <w:tr>
-        <w:tblPrEx>
-          <w:tblCellMar>
-            <w:top w:w="0" w:type="dxa"/>
-            <w:bottom w:w="0" w:type="dxa"/>
-          </w:tblCellMar>
-        </w:tblPrEx>
         <w:tc>
           <w:tcPr>
             <w:tcW w:w="1893" w:type="dxa"/>
@@ -22311,12 +22125,6 @@
         </w:tc>
       </w:tr>
       <w:tr>
-        <w:tblPrEx>
-          <w:tblCellMar>
-            <w:top w:w="0" w:type="dxa"/>
-            <w:bottom w:w="0" w:type="dxa"/>
-          </w:tblCellMar>
-        </w:tblPrEx>
         <w:tc>
           <w:tcPr>
             <w:tcW w:w="1893" w:type="dxa"/>
@@ -22479,12 +22287,6 @@
         </w:tc>
       </w:tr>
       <w:tr>
-        <w:tblPrEx>
-          <w:tblCellMar>
-            <w:top w:w="0" w:type="dxa"/>
-            <w:bottom w:w="0" w:type="dxa"/>
-          </w:tblCellMar>
-        </w:tblPrEx>
         <w:tc>
           <w:tcPr>
             <w:tcW w:w="1893" w:type="dxa"/>
@@ -22647,12 +22449,6 @@
         </w:tc>
       </w:tr>
       <w:tr>
-        <w:tblPrEx>
-          <w:tblCellMar>
-            <w:top w:w="0" w:type="dxa"/>
-            <w:bottom w:w="0" w:type="dxa"/>
-          </w:tblCellMar>
-        </w:tblPrEx>
         <w:tc>
           <w:tcPr>
             <w:tcW w:w="1893" w:type="dxa"/>
@@ -22840,6 +22636,9 @@
         <w:spacing w:after="120" w:line="276" w:lineRule="auto"/>
         <w:ind w:firstLine="720"/>
         <w:jc w:val="both"/>
+        <w:rPr>
+          <w:rFonts w:ascii="Times New Roman" w:hAnsi="Times New Roman" w:cs="Times New Roman"/>
+        </w:rPr>
       </w:pPr>
       <w:r>
         <w:rPr>
@@ -22899,22 +22698,1659 @@
     <w:p>
       <w:pPr>
         <w:pStyle w:val="Heading1"/>
+        <w:rPr>
+          <w:rFonts w:ascii="Times New Roman" w:hAnsi="Times New Roman" w:cs="Times New Roman"/>
+        </w:rPr>
+      </w:pPr>
+      <w:r>
+        <w:rPr>
+          <w:rFonts w:ascii="Times New Roman" w:hAnsi="Times New Roman" w:cs="Times New Roman"/>
+        </w:rPr>
+        <w:lastRenderedPageBreak/>
+        <w:t xml:space="preserve">4 Moderne </w:t>
+      </w:r>
+      <w:proofErr w:type="spellStart"/>
+      <w:r>
+        <w:rPr>
+          <w:rFonts w:ascii="Times New Roman" w:hAnsi="Times New Roman" w:cs="Times New Roman"/>
+        </w:rPr>
+        <w:t>arhitekture</w:t>
+      </w:r>
+      <w:proofErr w:type="spellEnd"/>
+      <w:r>
+        <w:rPr>
+          <w:rFonts w:ascii="Times New Roman" w:hAnsi="Times New Roman" w:cs="Times New Roman"/>
+        </w:rPr>
+        <w:t xml:space="preserve"> za </w:t>
+      </w:r>
+      <w:proofErr w:type="spellStart"/>
+      <w:r>
+        <w:rPr>
+          <w:rFonts w:ascii="Times New Roman" w:hAnsi="Times New Roman" w:cs="Times New Roman"/>
+        </w:rPr>
+        <w:t>klasifikaciju</w:t>
+      </w:r>
+      <w:proofErr w:type="spellEnd"/>
+      <w:r>
+        <w:rPr>
+          <w:rFonts w:ascii="Times New Roman" w:hAnsi="Times New Roman" w:cs="Times New Roman"/>
+        </w:rPr>
+        <w:t xml:space="preserve"> </w:t>
+      </w:r>
+      <w:proofErr w:type="spellStart"/>
+      <w:r>
+        <w:rPr>
+          <w:rFonts w:ascii="Times New Roman" w:hAnsi="Times New Roman" w:cs="Times New Roman"/>
+        </w:rPr>
+        <w:t>dermatoskopskih</w:t>
+      </w:r>
+      <w:proofErr w:type="spellEnd"/>
+      <w:r>
+        <w:rPr>
+          <w:rFonts w:ascii="Times New Roman" w:hAnsi="Times New Roman" w:cs="Times New Roman"/>
+        </w:rPr>
+        <w:t xml:space="preserve"> </w:t>
+      </w:r>
+      <w:proofErr w:type="spellStart"/>
+      <w:r>
+        <w:rPr>
+          <w:rFonts w:ascii="Times New Roman" w:hAnsi="Times New Roman" w:cs="Times New Roman"/>
+        </w:rPr>
+        <w:t>slika</w:t>
+      </w:r>
+      <w:proofErr w:type="spellEnd"/>
+    </w:p>
+    <w:p>
+      <w:pPr>
+        <w:rPr>
+          <w:rFonts w:ascii="Times New Roman" w:hAnsi="Times New Roman" w:cs="Times New Roman"/>
+        </w:rPr>
+      </w:pPr>
+    </w:p>
+    <w:p>
+      <w:pPr>
+        <w:spacing w:after="120" w:line="276" w:lineRule="auto"/>
+        <w:ind w:firstLine="720"/>
+        <w:jc w:val="both"/>
+        <w:rPr>
+          <w:rFonts w:ascii="Times New Roman" w:eastAsia="Times New Roman" w:hAnsi="Times New Roman" w:cs="Times New Roman"/>
+          <w:sz w:val="24"/>
+          <w:szCs w:val="24"/>
+        </w:rPr>
+      </w:pPr>
+      <w:r>
+        <w:rPr>
+          <w:rFonts w:ascii="Times New Roman" w:eastAsia="Times New Roman" w:hAnsi="Times New Roman" w:cs="Times New Roman"/>
+          <w:sz w:val="24"/>
+          <w:szCs w:val="24"/>
+        </w:rPr>
+        <w:t>Pored klasičnih tehnika predobrade opisanih u prethodnom poglavlju, ključan faktor koji određuje konačne performanse sistema za klasifikaciju kožnih lezija jeste izbor arhitekture neuronske mreže. U ovom poglavlju su opisane dve arhitekture koje su posebno relevantne za HAM10000 dataset: U-Net, koji se koristi kao predobradni korak za segmentaciju lezije, i EfficientNet, koji predstavlja trenutni standard za klasifikaciju dermoskopskih slika.</w:t>
+      </w:r>
+    </w:p>
+    <w:p>
+      <w:pPr>
+        <w:rPr>
+          <w:rFonts w:ascii="Times New Roman" w:hAnsi="Times New Roman" w:cs="Times New Roman"/>
+        </w:rPr>
+      </w:pPr>
+    </w:p>
+    <w:p>
+      <w:pPr>
+        <w:pStyle w:val="Heading2"/>
         <w:spacing w:line="276" w:lineRule="auto"/>
         <w:rPr>
+          <w:rFonts w:ascii="Times New Roman" w:hAnsi="Times New Roman" w:cs="Times New Roman"/>
+        </w:rPr>
+      </w:pPr>
+      <w:r>
+        <w:rPr>
+          <w:rFonts w:ascii="Times New Roman" w:eastAsia="Times New Roman" w:hAnsi="Times New Roman" w:cs="Times New Roman"/>
+          <w:sz w:val="24"/>
+          <w:szCs w:val="24"/>
+        </w:rPr>
+        <w:t>4.1 U-Net arhitektura za segmentaciju lezija</w:t>
+      </w:r>
+    </w:p>
+    <w:p>
+      <w:pPr>
+        <w:rPr>
+          <w:rFonts w:ascii="Times New Roman" w:hAnsi="Times New Roman" w:cs="Times New Roman"/>
+        </w:rPr>
+      </w:pPr>
+    </w:p>
+    <w:p>
+      <w:pPr>
+        <w:spacing w:after="120" w:line="276" w:lineRule="auto"/>
+        <w:ind w:firstLine="720"/>
+        <w:jc w:val="both"/>
+        <w:rPr>
+          <w:rFonts w:ascii="Times New Roman" w:eastAsia="Times New Roman" w:hAnsi="Times New Roman" w:cs="Times New Roman"/>
+          <w:sz w:val="24"/>
+          <w:szCs w:val="24"/>
+        </w:rPr>
+      </w:pPr>
+      <w:r>
+        <w:rPr>
+          <w:rFonts w:ascii="Times New Roman" w:eastAsia="Times New Roman" w:hAnsi="Times New Roman" w:cs="Times New Roman"/>
+          <w:sz w:val="24"/>
+          <w:szCs w:val="24"/>
+        </w:rPr>
+        <w:t>U-Net je konvoluciona neuronska mreža predložena od strane Ronneberger et al. (2015) originalno za segmentaciju biomedicinskih slika. Ime dolazi od karakteristične simetrične encoder-decoder arhitekture čiji grafički prikaz podseća na slovo U. U kontekstu dermatoskopije, U-Net se etablirao kao standardna tehnika za automatsku segmentaciju kožnih lezija jer može precizno da detektuje i ivice lezije i njen unutrašnji region čak i kod nepravilnih i nejasno ograničenih lezija kod kojih jednostavne metode pragovanja ili aktivnih kontura otkazuju.</w:t>
+      </w:r>
+    </w:p>
+    <w:p>
+      <w:pPr>
+        <w:jc w:val="center"/>
+        <w:rPr>
+          <w:rFonts w:ascii="Times New Roman" w:hAnsi="Times New Roman" w:cs="Times New Roman"/>
+        </w:rPr>
+      </w:pPr>
+      <w:r>
+        <w:rPr>
+          <w:rFonts w:ascii="Times New Roman" w:hAnsi="Times New Roman" w:cs="Times New Roman"/>
+        </w:rPr>
+        <w:drawing>
+          <wp:inline distT="0" distB="0" distL="0" distR="0" wp14:anchorId="6C44253B" wp14:editId="69AF0DDD">
+            <wp:extent cx="5223625" cy="2618509"/>
+            <wp:effectExtent l="0" t="0" r="0" b="0"/>
+            <wp:docPr id="1833760312" name="Picture 1"/>
+            <wp:cNvGraphicFramePr>
+              <a:graphicFrameLocks xmlns:a="http://schemas.openxmlformats.org/drawingml/2006/main" noChangeAspect="1"/>
+            </wp:cNvGraphicFramePr>
+            <a:graphic xmlns:a="http://schemas.openxmlformats.org/drawingml/2006/main">
+              <a:graphicData uri="http://schemas.openxmlformats.org/drawingml/2006/picture">
+                <pic:pic xmlns:pic="http://schemas.openxmlformats.org/drawingml/2006/picture">
+                  <pic:nvPicPr>
+                    <pic:cNvPr id="1833760312" name=""/>
+                    <pic:cNvPicPr/>
+                  </pic:nvPicPr>
+                  <pic:blipFill>
+                    <a:blip r:embed="rId15"/>
+                    <a:stretch>
+                      <a:fillRect/>
+                    </a:stretch>
+                  </pic:blipFill>
+                  <pic:spPr>
+                    <a:xfrm>
+                      <a:off x="0" y="0"/>
+                      <a:ext cx="5233771" cy="2623595"/>
+                    </a:xfrm>
+                    <a:prstGeom prst="rect">
+                      <a:avLst/>
+                    </a:prstGeom>
+                  </pic:spPr>
+                </pic:pic>
+              </a:graphicData>
+            </a:graphic>
+          </wp:inline>
+        </w:drawing>
+      </w:r>
+    </w:p>
+    <w:p>
+      <w:pPr>
+        <w:spacing w:before="120" w:after="120" w:line="276" w:lineRule="auto"/>
+        <w:jc w:val="center"/>
+        <w:rPr>
+          <w:rFonts w:ascii="Times New Roman" w:hAnsi="Times New Roman" w:cs="Times New Roman"/>
+        </w:rPr>
+      </w:pPr>
+      <w:r>
+        <w:rPr>
+          <w:rFonts w:ascii="Times New Roman" w:eastAsia="Times New Roman" w:hAnsi="Times New Roman" w:cs="Times New Roman"/>
+          <w:sz w:val="24"/>
+          <w:szCs w:val="24"/>
+        </w:rPr>
+        <w:t>Slika 4.1.1</w:t>
+      </w:r>
+      <w:r>
+        <w:rPr>
+          <w:rFonts w:ascii="Times New Roman" w:eastAsia="Times New Roman" w:hAnsi="Times New Roman" w:cs="Times New Roman"/>
+          <w:sz w:val="24"/>
+          <w:szCs w:val="24"/>
+        </w:rPr>
+        <w:t xml:space="preserve"> </w:t>
+      </w:r>
+      <w:r>
+        <w:rPr>
+          <w:rFonts w:ascii="Times New Roman" w:eastAsia="Times New Roman" w:hAnsi="Times New Roman" w:cs="Times New Roman"/>
+          <w:sz w:val="24"/>
+          <w:szCs w:val="24"/>
+        </w:rPr>
+        <w:t xml:space="preserve"> Arhitektura U-Net mreže </w:t>
+      </w:r>
+    </w:p>
+    <w:p>
+      <w:pPr>
+        <w:rPr>
+          <w:rFonts w:ascii="Times New Roman" w:hAnsi="Times New Roman" w:cs="Times New Roman"/>
+        </w:rPr>
+      </w:pPr>
+    </w:p>
+    <w:p>
+      <w:pPr>
+        <w:rPr>
+          <w:rFonts w:ascii="Times New Roman" w:hAnsi="Times New Roman" w:cs="Times New Roman"/>
+        </w:rPr>
+      </w:pPr>
+    </w:p>
+    <w:p>
+      <w:pPr>
+        <w:rPr>
+          <w:rFonts w:ascii="Times New Roman" w:hAnsi="Times New Roman" w:cs="Times New Roman"/>
+        </w:rPr>
+      </w:pPr>
+    </w:p>
+    <w:p>
+      <w:pPr>
+        <w:rPr>
+          <w:rFonts w:ascii="Times New Roman" w:hAnsi="Times New Roman" w:cs="Times New Roman"/>
+        </w:rPr>
+      </w:pPr>
+    </w:p>
+    <w:p>
+      <w:pPr>
+        <w:spacing w:after="120" w:line="276" w:lineRule="auto"/>
+        <w:ind w:firstLine="720"/>
+        <w:jc w:val="both"/>
+        <w:rPr>
+          <w:rFonts w:ascii="Times New Roman" w:eastAsia="Times New Roman" w:hAnsi="Times New Roman" w:cs="Times New Roman"/>
+          <w:sz w:val="24"/>
+          <w:szCs w:val="24"/>
+        </w:rPr>
+      </w:pPr>
+      <w:r>
+        <w:rPr>
+          <w:rFonts w:ascii="Times New Roman" w:eastAsia="Times New Roman" w:hAnsi="Times New Roman" w:cs="Times New Roman"/>
+          <w:sz w:val="24"/>
+          <w:szCs w:val="24"/>
+        </w:rPr>
+        <w:lastRenderedPageBreak/>
+        <w:t>Arhitektura U-Net se sastoji od četiri ključne komponente:</w:t>
+      </w:r>
+    </w:p>
+    <w:p>
+      <w:pPr>
+        <w:rPr>
+          <w:rFonts w:ascii="Times New Roman" w:hAnsi="Times New Roman" w:cs="Times New Roman"/>
+        </w:rPr>
+      </w:pPr>
+    </w:p>
+    <w:p>
+      <w:pPr>
+        <w:pStyle w:val="ListParagraph"/>
+        <w:numPr>
+          <w:ilvl w:val="0"/>
+          <w:numId w:val="27"/>
+        </w:numPr>
+        <w:spacing w:before="60" w:after="60" w:line="276" w:lineRule="auto"/>
+        <w:contextualSpacing w:val="0"/>
+        <w:jc w:val="both"/>
+        <w:rPr>
+          <w:rFonts w:ascii="Times New Roman" w:hAnsi="Times New Roman" w:cs="Times New Roman"/>
+        </w:rPr>
+      </w:pPr>
+      <w:r>
+        <w:rPr>
+          <w:rFonts w:ascii="Times New Roman" w:eastAsia="Times New Roman" w:hAnsi="Times New Roman" w:cs="Times New Roman"/>
+          <w:b/>
+          <w:bCs/>
+        </w:rPr>
+        <w:t>Encoder</w:t>
+      </w:r>
+      <w:r>
+        <w:rPr>
+          <w:rFonts w:ascii="Times New Roman" w:eastAsia="Times New Roman" w:hAnsi="Times New Roman" w:cs="Times New Roman"/>
+        </w:rPr>
+        <w:t xml:space="preserve">: </w:t>
+      </w:r>
+      <w:r>
+        <w:rPr>
+          <w:rFonts w:ascii="Times New Roman" w:eastAsia="Times New Roman" w:hAnsi="Times New Roman" w:cs="Times New Roman"/>
+        </w:rPr>
+        <w:t xml:space="preserve">Serija </w:t>
+      </w:r>
+      <w:proofErr w:type="spellStart"/>
+      <w:r>
+        <w:rPr>
+          <w:rFonts w:ascii="Times New Roman" w:eastAsia="Times New Roman" w:hAnsi="Times New Roman" w:cs="Times New Roman"/>
+        </w:rPr>
+        <w:t>konvolucionih</w:t>
+      </w:r>
+      <w:proofErr w:type="spellEnd"/>
+      <w:r>
+        <w:rPr>
+          <w:rFonts w:ascii="Times New Roman" w:eastAsia="Times New Roman" w:hAnsi="Times New Roman" w:cs="Times New Roman"/>
+        </w:rPr>
+        <w:t xml:space="preserve"> </w:t>
+      </w:r>
+      <w:proofErr w:type="spellStart"/>
+      <w:r>
+        <w:rPr>
+          <w:rFonts w:ascii="Times New Roman" w:eastAsia="Times New Roman" w:hAnsi="Times New Roman" w:cs="Times New Roman"/>
+        </w:rPr>
+        <w:t>blokova</w:t>
+      </w:r>
+      <w:proofErr w:type="spellEnd"/>
+      <w:r>
+        <w:rPr>
+          <w:rFonts w:ascii="Times New Roman" w:eastAsia="Times New Roman" w:hAnsi="Times New Roman" w:cs="Times New Roman"/>
+        </w:rPr>
+        <w:t xml:space="preserve">, </w:t>
+      </w:r>
+      <w:proofErr w:type="spellStart"/>
+      <w:r>
+        <w:rPr>
+          <w:rFonts w:ascii="Times New Roman" w:eastAsia="Times New Roman" w:hAnsi="Times New Roman" w:cs="Times New Roman"/>
+        </w:rPr>
+        <w:t>tipično</w:t>
+      </w:r>
+      <w:proofErr w:type="spellEnd"/>
+      <w:r>
+        <w:rPr>
+          <w:rFonts w:ascii="Times New Roman" w:eastAsia="Times New Roman" w:hAnsi="Times New Roman" w:cs="Times New Roman"/>
+        </w:rPr>
+        <w:t xml:space="preserve"> </w:t>
+      </w:r>
+      <w:proofErr w:type="spellStart"/>
+      <w:r>
+        <w:rPr>
+          <w:rFonts w:ascii="Times New Roman" w:eastAsia="Times New Roman" w:hAnsi="Times New Roman" w:cs="Times New Roman"/>
+        </w:rPr>
+        <w:t>dva</w:t>
+      </w:r>
+      <w:proofErr w:type="spellEnd"/>
+      <w:r>
+        <w:rPr>
+          <w:rFonts w:ascii="Times New Roman" w:eastAsia="Times New Roman" w:hAnsi="Times New Roman" w:cs="Times New Roman"/>
+        </w:rPr>
+        <w:t xml:space="preserve"> 3x3 konvoluciona sloja sa ReLU aktivacijom po bloku, praćenih max-pooling operacijom koja prepolovljava prostornu rezoluciju. Sa svakim korakom, rezolucija feature mapa se smanjuje dok se broj kanala udvostručuje, od 64 do 512 kanala u originalnoj arhitekturi. Encoder </w:t>
+      </w:r>
+      <w:proofErr w:type="spellStart"/>
+      <w:r>
+        <w:rPr>
+          <w:rFonts w:ascii="Times New Roman" w:eastAsia="Times New Roman" w:hAnsi="Times New Roman" w:cs="Times New Roman"/>
+        </w:rPr>
+        <w:t>hijerarhijski</w:t>
+      </w:r>
+      <w:proofErr w:type="spellEnd"/>
+      <w:r>
+        <w:rPr>
+          <w:rFonts w:ascii="Times New Roman" w:eastAsia="Times New Roman" w:hAnsi="Times New Roman" w:cs="Times New Roman"/>
+        </w:rPr>
+        <w:t xml:space="preserve"> </w:t>
+      </w:r>
+      <w:proofErr w:type="spellStart"/>
+      <w:r>
+        <w:rPr>
+          <w:rFonts w:ascii="Times New Roman" w:eastAsia="Times New Roman" w:hAnsi="Times New Roman" w:cs="Times New Roman"/>
+        </w:rPr>
+        <w:t>ekstrahuje</w:t>
+      </w:r>
+      <w:proofErr w:type="spellEnd"/>
+      <w:r>
+        <w:rPr>
+          <w:rFonts w:ascii="Times New Roman" w:eastAsia="Times New Roman" w:hAnsi="Times New Roman" w:cs="Times New Roman"/>
+        </w:rPr>
+        <w:t xml:space="preserve"> </w:t>
+      </w:r>
+      <w:proofErr w:type="spellStart"/>
+      <w:r>
+        <w:rPr>
+          <w:rFonts w:ascii="Times New Roman" w:eastAsia="Times New Roman" w:hAnsi="Times New Roman" w:cs="Times New Roman"/>
+        </w:rPr>
+        <w:t>vizuelne</w:t>
+      </w:r>
+      <w:proofErr w:type="spellEnd"/>
+      <w:r>
+        <w:rPr>
+          <w:rFonts w:ascii="Times New Roman" w:eastAsia="Times New Roman" w:hAnsi="Times New Roman" w:cs="Times New Roman"/>
+        </w:rPr>
+        <w:t xml:space="preserve"> </w:t>
+      </w:r>
+      <w:proofErr w:type="spellStart"/>
+      <w:r>
+        <w:rPr>
+          <w:rFonts w:ascii="Times New Roman" w:eastAsia="Times New Roman" w:hAnsi="Times New Roman" w:cs="Times New Roman"/>
+        </w:rPr>
+        <w:t>karakteristike</w:t>
+      </w:r>
+      <w:proofErr w:type="spellEnd"/>
+      <w:r>
+        <w:rPr>
+          <w:rFonts w:ascii="Times New Roman" w:eastAsia="Times New Roman" w:hAnsi="Times New Roman" w:cs="Times New Roman"/>
+        </w:rPr>
+        <w:t xml:space="preserve">, </w:t>
+      </w:r>
+      <w:r>
+        <w:rPr>
+          <w:rFonts w:ascii="Times New Roman" w:eastAsia="Times New Roman" w:hAnsi="Times New Roman" w:cs="Times New Roman"/>
+        </w:rPr>
+        <w:t xml:space="preserve">od </w:t>
+      </w:r>
+      <w:proofErr w:type="spellStart"/>
+      <w:r>
+        <w:rPr>
+          <w:rFonts w:ascii="Times New Roman" w:eastAsia="Times New Roman" w:hAnsi="Times New Roman" w:cs="Times New Roman"/>
+        </w:rPr>
+        <w:t>ivica</w:t>
+      </w:r>
+      <w:proofErr w:type="spellEnd"/>
+      <w:r>
+        <w:rPr>
+          <w:rFonts w:ascii="Times New Roman" w:eastAsia="Times New Roman" w:hAnsi="Times New Roman" w:cs="Times New Roman"/>
+        </w:rPr>
+        <w:t xml:space="preserve"> </w:t>
+      </w:r>
+      <w:proofErr w:type="spellStart"/>
+      <w:r>
+        <w:rPr>
+          <w:rFonts w:ascii="Times New Roman" w:eastAsia="Times New Roman" w:hAnsi="Times New Roman" w:cs="Times New Roman"/>
+        </w:rPr>
+        <w:t>i</w:t>
+      </w:r>
+      <w:proofErr w:type="spellEnd"/>
+      <w:r>
+        <w:rPr>
+          <w:rFonts w:ascii="Times New Roman" w:eastAsia="Times New Roman" w:hAnsi="Times New Roman" w:cs="Times New Roman"/>
+        </w:rPr>
+        <w:t xml:space="preserve"> </w:t>
+      </w:r>
+      <w:proofErr w:type="spellStart"/>
+      <w:r>
+        <w:rPr>
+          <w:rFonts w:ascii="Times New Roman" w:eastAsia="Times New Roman" w:hAnsi="Times New Roman" w:cs="Times New Roman"/>
+        </w:rPr>
+        <w:t>tekstura</w:t>
+      </w:r>
+      <w:proofErr w:type="spellEnd"/>
+      <w:r>
+        <w:rPr>
+          <w:rFonts w:ascii="Times New Roman" w:eastAsia="Times New Roman" w:hAnsi="Times New Roman" w:cs="Times New Roman"/>
+        </w:rPr>
+        <w:t xml:space="preserve"> u </w:t>
+      </w:r>
+      <w:proofErr w:type="spellStart"/>
+      <w:r>
+        <w:rPr>
+          <w:rFonts w:ascii="Times New Roman" w:eastAsia="Times New Roman" w:hAnsi="Times New Roman" w:cs="Times New Roman"/>
+        </w:rPr>
+        <w:t>plitkim</w:t>
+      </w:r>
+      <w:proofErr w:type="spellEnd"/>
+      <w:r>
+        <w:rPr>
+          <w:rFonts w:ascii="Times New Roman" w:eastAsia="Times New Roman" w:hAnsi="Times New Roman" w:cs="Times New Roman"/>
+        </w:rPr>
+        <w:t xml:space="preserve"> </w:t>
+      </w:r>
+      <w:proofErr w:type="spellStart"/>
+      <w:r>
+        <w:rPr>
+          <w:rFonts w:ascii="Times New Roman" w:eastAsia="Times New Roman" w:hAnsi="Times New Roman" w:cs="Times New Roman"/>
+        </w:rPr>
+        <w:t>slojevima</w:t>
+      </w:r>
+      <w:proofErr w:type="spellEnd"/>
+      <w:r>
+        <w:rPr>
+          <w:rFonts w:ascii="Times New Roman" w:eastAsia="Times New Roman" w:hAnsi="Times New Roman" w:cs="Times New Roman"/>
+        </w:rPr>
+        <w:t xml:space="preserve"> do semantičkih karakteristika oblika lezije u dubokim slojevima.</w:t>
+      </w:r>
+    </w:p>
+    <w:p>
+      <w:pPr>
+        <w:pStyle w:val="ListParagraph"/>
+        <w:numPr>
+          <w:ilvl w:val="0"/>
+          <w:numId w:val="27"/>
+        </w:numPr>
+        <w:spacing w:before="60" w:after="60" w:line="276" w:lineRule="auto"/>
+        <w:contextualSpacing w:val="0"/>
+        <w:jc w:val="both"/>
+        <w:rPr>
+          <w:rFonts w:ascii="Times New Roman" w:hAnsi="Times New Roman" w:cs="Times New Roman"/>
+        </w:rPr>
+      </w:pPr>
+      <w:r>
+        <w:rPr>
+          <w:rFonts w:ascii="Times New Roman" w:eastAsia="Times New Roman" w:hAnsi="Times New Roman" w:cs="Times New Roman"/>
+          <w:b/>
+          <w:bCs/>
+        </w:rPr>
+        <w:t>Bottleneck</w:t>
+      </w:r>
+      <w:r>
+        <w:rPr>
+          <w:rFonts w:ascii="Times New Roman" w:eastAsia="Times New Roman" w:hAnsi="Times New Roman" w:cs="Times New Roman"/>
+        </w:rPr>
+        <w:t>: Najdublja tačka mreže, sa najmanjom prostornom rezolucijom i najvećim brojem feature mapa, 1024 kanala u originalnoj arhitekturi. Bottleneck kodira najapstraktniju reprezentaciju ulazne slike i funkcioniše kao grlo između encoder i decoder putanja.</w:t>
+      </w:r>
+    </w:p>
+    <w:p>
+      <w:pPr>
+        <w:pStyle w:val="ListParagraph"/>
+        <w:numPr>
+          <w:ilvl w:val="0"/>
+          <w:numId w:val="27"/>
+        </w:numPr>
+        <w:spacing w:before="60" w:after="60" w:line="276" w:lineRule="auto"/>
+        <w:contextualSpacing w:val="0"/>
+        <w:jc w:val="both"/>
+        <w:rPr>
+          <w:rFonts w:ascii="Times New Roman" w:hAnsi="Times New Roman" w:cs="Times New Roman"/>
+        </w:rPr>
+      </w:pPr>
+      <w:r>
+        <w:rPr>
+          <w:rFonts w:ascii="Times New Roman" w:eastAsia="Times New Roman" w:hAnsi="Times New Roman" w:cs="Times New Roman"/>
+          <w:b/>
+          <w:bCs/>
+        </w:rPr>
+        <w:t>Decoder</w:t>
+      </w:r>
+      <w:r>
+        <w:rPr>
+          <w:rFonts w:ascii="Times New Roman" w:eastAsia="Times New Roman" w:hAnsi="Times New Roman" w:cs="Times New Roman"/>
+        </w:rPr>
+        <w:t>:</w:t>
+      </w:r>
+      <w:r>
+        <w:rPr>
+          <w:rFonts w:ascii="Times New Roman" w:eastAsia="Times New Roman" w:hAnsi="Times New Roman" w:cs="Times New Roman"/>
+        </w:rPr>
+        <w:t xml:space="preserve"> </w:t>
+      </w:r>
+      <w:proofErr w:type="spellStart"/>
+      <w:r>
+        <w:rPr>
+          <w:rFonts w:ascii="Times New Roman" w:eastAsia="Times New Roman" w:hAnsi="Times New Roman" w:cs="Times New Roman"/>
+        </w:rPr>
+        <w:t>Simetričan</w:t>
+      </w:r>
+      <w:proofErr w:type="spellEnd"/>
+      <w:r>
+        <w:rPr>
+          <w:rFonts w:ascii="Times New Roman" w:eastAsia="Times New Roman" w:hAnsi="Times New Roman" w:cs="Times New Roman"/>
+        </w:rPr>
+        <w:t xml:space="preserve"> encoder-u, </w:t>
+      </w:r>
+      <w:proofErr w:type="spellStart"/>
+      <w:r>
+        <w:rPr>
+          <w:rFonts w:ascii="Times New Roman" w:eastAsia="Times New Roman" w:hAnsi="Times New Roman" w:cs="Times New Roman"/>
+        </w:rPr>
+        <w:t>koristi</w:t>
+      </w:r>
+      <w:proofErr w:type="spellEnd"/>
+      <w:r>
+        <w:rPr>
+          <w:rFonts w:ascii="Times New Roman" w:eastAsia="Times New Roman" w:hAnsi="Times New Roman" w:cs="Times New Roman"/>
+        </w:rPr>
+        <w:t xml:space="preserve"> transponovane konvolucije za postepeno vraćanje prostorne rezolucije. Nakon svakog upsampling koraka, feature mape se konkatenišu sa odgovarajućim feature mapama iz encoder putanje putem skip konekcija, čime dekoder dobija pristup i apstraktnim semantičkim i visokorezolucijskim prostornim informacijama istovremeno.</w:t>
+      </w:r>
+    </w:p>
+    <w:p>
+      <w:pPr>
+        <w:pStyle w:val="ListParagraph"/>
+        <w:numPr>
+          <w:ilvl w:val="0"/>
+          <w:numId w:val="27"/>
+        </w:numPr>
+        <w:spacing w:before="60" w:after="60" w:line="276" w:lineRule="auto"/>
+        <w:contextualSpacing w:val="0"/>
+        <w:jc w:val="both"/>
+        <w:rPr>
+          <w:rFonts w:ascii="Times New Roman" w:hAnsi="Times New Roman" w:cs="Times New Roman"/>
+        </w:rPr>
+      </w:pPr>
+      <w:r>
+        <w:rPr>
+          <w:rFonts w:ascii="Times New Roman" w:eastAsia="Times New Roman" w:hAnsi="Times New Roman" w:cs="Times New Roman"/>
+          <w:b/>
+          <w:bCs/>
+        </w:rPr>
+        <w:t>Skip konekcije</w:t>
+      </w:r>
+      <w:r>
+        <w:rPr>
+          <w:rFonts w:ascii="Times New Roman" w:eastAsia="Times New Roman" w:hAnsi="Times New Roman" w:cs="Times New Roman"/>
+        </w:rPr>
+        <w:t xml:space="preserve">: Direktne veze koje konkatenišu encoder i decoder feature mape na istoj prostornoj skali. Ovo je </w:t>
+      </w:r>
+      <w:proofErr w:type="spellStart"/>
+      <w:r>
+        <w:rPr>
+          <w:rFonts w:ascii="Times New Roman" w:eastAsia="Times New Roman" w:hAnsi="Times New Roman" w:cs="Times New Roman"/>
+        </w:rPr>
+        <w:t>ključna</w:t>
+      </w:r>
+      <w:proofErr w:type="spellEnd"/>
+      <w:r>
+        <w:rPr>
+          <w:rFonts w:ascii="Times New Roman" w:eastAsia="Times New Roman" w:hAnsi="Times New Roman" w:cs="Times New Roman"/>
+        </w:rPr>
+        <w:t xml:space="preserve"> </w:t>
+      </w:r>
+      <w:proofErr w:type="spellStart"/>
+      <w:r>
+        <w:rPr>
+          <w:rFonts w:ascii="Times New Roman" w:eastAsia="Times New Roman" w:hAnsi="Times New Roman" w:cs="Times New Roman"/>
+        </w:rPr>
+        <w:t>inovacija</w:t>
+      </w:r>
+      <w:proofErr w:type="spellEnd"/>
+      <w:r>
+        <w:rPr>
+          <w:rFonts w:ascii="Times New Roman" w:eastAsia="Times New Roman" w:hAnsi="Times New Roman" w:cs="Times New Roman"/>
+        </w:rPr>
+        <w:t xml:space="preserve"> U-Net </w:t>
+      </w:r>
+      <w:proofErr w:type="spellStart"/>
+      <w:r>
+        <w:rPr>
+          <w:rFonts w:ascii="Times New Roman" w:eastAsia="Times New Roman" w:hAnsi="Times New Roman" w:cs="Times New Roman"/>
+        </w:rPr>
+        <w:t>arhitekture</w:t>
+      </w:r>
+      <w:proofErr w:type="spellEnd"/>
+      <w:r>
+        <w:rPr>
+          <w:rFonts w:ascii="Times New Roman" w:eastAsia="Times New Roman" w:hAnsi="Times New Roman" w:cs="Times New Roman"/>
+        </w:rPr>
+        <w:t>,</w:t>
+      </w:r>
+      <w:r>
+        <w:rPr>
+          <w:rFonts w:ascii="Times New Roman" w:eastAsia="Times New Roman" w:hAnsi="Times New Roman" w:cs="Times New Roman"/>
+        </w:rPr>
+        <w:t xml:space="preserve"> bez skip </w:t>
+      </w:r>
+      <w:proofErr w:type="spellStart"/>
+      <w:r>
+        <w:rPr>
+          <w:rFonts w:ascii="Times New Roman" w:eastAsia="Times New Roman" w:hAnsi="Times New Roman" w:cs="Times New Roman"/>
+        </w:rPr>
+        <w:t>konekcija</w:t>
+      </w:r>
+      <w:proofErr w:type="spellEnd"/>
+      <w:r>
+        <w:rPr>
+          <w:rFonts w:ascii="Times New Roman" w:eastAsia="Times New Roman" w:hAnsi="Times New Roman" w:cs="Times New Roman"/>
+        </w:rPr>
+        <w:t>, prostorne informacije o ivicama i finoj teksturi bile bi nepovratno izgubljene tokom downsampling operacija. Zahvaljujući skip konekcijama, U-Net precizno detektuje tanke ivice lezija koje raniji encoder-only pristupi ne mogu pouzdano da rekonstruišu.</w:t>
+      </w:r>
+    </w:p>
+    <w:p>
+      <w:pPr>
+        <w:rPr>
+          <w:rFonts w:ascii="Times New Roman" w:hAnsi="Times New Roman" w:cs="Times New Roman"/>
+        </w:rPr>
+      </w:pPr>
+    </w:p>
+    <w:p>
+      <w:pPr>
+        <w:spacing w:after="120" w:line="276" w:lineRule="auto"/>
+        <w:ind w:firstLine="720"/>
+        <w:jc w:val="both"/>
+        <w:rPr>
+          <w:rFonts w:ascii="Times New Roman" w:eastAsia="Times New Roman" w:hAnsi="Times New Roman" w:cs="Times New Roman"/>
+          <w:sz w:val="24"/>
+          <w:szCs w:val="24"/>
+        </w:rPr>
+      </w:pPr>
+      <w:r>
+        <w:rPr>
+          <w:rFonts w:ascii="Times New Roman" w:eastAsia="Times New Roman" w:hAnsi="Times New Roman" w:cs="Times New Roman"/>
+          <w:sz w:val="24"/>
+          <w:szCs w:val="24"/>
+        </w:rPr>
+        <w:t>Izlaz mreže je mapa piksel-po-piksel klasifikacije iste prostorne rezolucije kao ulazna slika. Za binarnu segmentaciju, odnosno lezija nasuprot pozadini, finalni sloj koristi sigmoid aktivaciju, a binarna maska se dobija pragom od 0.5.</w:t>
+      </w:r>
+    </w:p>
+    <w:p>
+      <w:pPr>
+        <w:jc w:val="center"/>
+        <w:rPr>
+          <w:rFonts w:ascii="Times New Roman" w:hAnsi="Times New Roman" w:cs="Times New Roman"/>
+        </w:rPr>
+      </w:pPr>
+      <w:r>
+        <w:rPr>
+          <w:rFonts w:ascii="Times New Roman" w:hAnsi="Times New Roman" w:cs="Times New Roman"/>
+        </w:rPr>
+        <w:drawing>
+          <wp:inline distT="0" distB="0" distL="0" distR="0" wp14:anchorId="71A17C8D" wp14:editId="016D3A75">
+            <wp:extent cx="5943600" cy="1604010"/>
+            <wp:effectExtent l="0" t="0" r="0" b="0"/>
+            <wp:docPr id="1815230456" name="Picture 1"/>
+            <wp:cNvGraphicFramePr>
+              <a:graphicFrameLocks xmlns:a="http://schemas.openxmlformats.org/drawingml/2006/main" noChangeAspect="1"/>
+            </wp:cNvGraphicFramePr>
+            <a:graphic xmlns:a="http://schemas.openxmlformats.org/drawingml/2006/main">
+              <a:graphicData uri="http://schemas.openxmlformats.org/drawingml/2006/picture">
+                <pic:pic xmlns:pic="http://schemas.openxmlformats.org/drawingml/2006/picture">
+                  <pic:nvPicPr>
+                    <pic:cNvPr id="1815230456" name=""/>
+                    <pic:cNvPicPr/>
+                  </pic:nvPicPr>
+                  <pic:blipFill>
+                    <a:blip r:embed="rId16"/>
+                    <a:stretch>
+                      <a:fillRect/>
+                    </a:stretch>
+                  </pic:blipFill>
+                  <pic:spPr>
+                    <a:xfrm>
+                      <a:off x="0" y="0"/>
+                      <a:ext cx="5943600" cy="1604010"/>
+                    </a:xfrm>
+                    <a:prstGeom prst="rect">
+                      <a:avLst/>
+                    </a:prstGeom>
+                  </pic:spPr>
+                </pic:pic>
+              </a:graphicData>
+            </a:graphic>
+          </wp:inline>
+        </w:drawing>
+      </w:r>
+    </w:p>
+    <w:p>
+      <w:pPr>
+        <w:spacing w:before="120" w:after="120" w:line="276" w:lineRule="auto"/>
+        <w:jc w:val="center"/>
+        <w:rPr>
+          <w:rFonts w:ascii="Times New Roman" w:hAnsi="Times New Roman" w:cs="Times New Roman"/>
+        </w:rPr>
+      </w:pPr>
+      <w:r>
+        <w:rPr>
+          <w:rFonts w:ascii="Times New Roman" w:eastAsia="Times New Roman" w:hAnsi="Times New Roman" w:cs="Times New Roman"/>
+          <w:sz w:val="24"/>
+          <w:szCs w:val="24"/>
+        </w:rPr>
+        <w:t>Slika 4.1.2  Primer segmentacije kožne lezije U-Net mrežom na HAM10000: originalna slika, predikovana maska i preklopljeni prikaz</w:t>
+      </w:r>
+    </w:p>
+    <w:p>
+      <w:pPr>
+        <w:rPr>
+          <w:rFonts w:ascii="Times New Roman" w:hAnsi="Times New Roman" w:cs="Times New Roman"/>
+        </w:rPr>
+      </w:pPr>
+    </w:p>
+    <w:p>
+      <w:pPr>
+        <w:spacing w:after="120" w:line="276" w:lineRule="auto"/>
+        <w:ind w:firstLine="720"/>
+        <w:jc w:val="both"/>
+        <w:rPr>
+          <w:rFonts w:ascii="Times New Roman" w:eastAsia="Times New Roman" w:hAnsi="Times New Roman" w:cs="Times New Roman"/>
+          <w:sz w:val="24"/>
+          <w:szCs w:val="24"/>
+        </w:rPr>
+      </w:pPr>
+      <w:r>
+        <w:rPr>
+          <w:rFonts w:ascii="Times New Roman" w:eastAsia="Times New Roman" w:hAnsi="Times New Roman" w:cs="Times New Roman"/>
+          <w:sz w:val="24"/>
+          <w:szCs w:val="24"/>
+        </w:rPr>
+        <w:lastRenderedPageBreak/>
+        <w:t>Za primenu kao predobradn</w:t>
+      </w:r>
+      <w:r>
+        <w:rPr>
+          <w:rFonts w:ascii="Times New Roman" w:eastAsia="Times New Roman" w:hAnsi="Times New Roman" w:cs="Times New Roman"/>
+          <w:sz w:val="24"/>
+          <w:szCs w:val="24"/>
+        </w:rPr>
+        <w:t>i</w:t>
+      </w:r>
+      <w:r>
+        <w:rPr>
+          <w:rFonts w:ascii="Times New Roman" w:eastAsia="Times New Roman" w:hAnsi="Times New Roman" w:cs="Times New Roman"/>
+          <w:sz w:val="24"/>
+          <w:szCs w:val="24"/>
+        </w:rPr>
+        <w:t xml:space="preserve"> korak u klasifikacionom pipeline-u, U-Net segmentacija funkcioniše u dva koraka:</w:t>
+      </w:r>
+    </w:p>
+    <w:p>
+      <w:pPr>
+        <w:rPr>
+          <w:rFonts w:ascii="Times New Roman" w:hAnsi="Times New Roman" w:cs="Times New Roman"/>
+        </w:rPr>
+      </w:pPr>
+    </w:p>
+    <w:p>
+      <w:pPr>
+        <w:pStyle w:val="ListParagraph"/>
+        <w:numPr>
+          <w:ilvl w:val="0"/>
+          <w:numId w:val="28"/>
+        </w:numPr>
+        <w:spacing w:before="60" w:after="60" w:line="276" w:lineRule="auto"/>
+        <w:contextualSpacing w:val="0"/>
+        <w:jc w:val="both"/>
+        <w:rPr>
+          <w:rFonts w:ascii="Times New Roman" w:hAnsi="Times New Roman" w:cs="Times New Roman"/>
+        </w:rPr>
+      </w:pPr>
+      <w:r>
+        <w:rPr>
+          <w:rFonts w:ascii="Times New Roman" w:eastAsia="Times New Roman" w:hAnsi="Times New Roman" w:cs="Times New Roman"/>
+        </w:rPr>
+        <w:t>Treniranje segmentacionog modela na anotiranom skupu slika sa piksel-preciznim maskama. Na primer, ISIC segmentacioni skup sadrži 2.594 ručno anotiranih dermoskopskih slika sa odgovarajućim maskama lezija.</w:t>
+      </w:r>
+    </w:p>
+    <w:p>
+      <w:pPr>
+        <w:pStyle w:val="ListParagraph"/>
+        <w:numPr>
+          <w:ilvl w:val="0"/>
+          <w:numId w:val="28"/>
+        </w:numPr>
+        <w:spacing w:before="60" w:after="60" w:line="276" w:lineRule="auto"/>
+        <w:contextualSpacing w:val="0"/>
+        <w:jc w:val="both"/>
+        <w:rPr>
+          <w:rFonts w:ascii="Times New Roman" w:hAnsi="Times New Roman" w:cs="Times New Roman"/>
+        </w:rPr>
+      </w:pPr>
+      <w:r>
+        <w:rPr>
+          <w:rFonts w:ascii="Times New Roman" w:eastAsia="Times New Roman" w:hAnsi="Times New Roman" w:cs="Times New Roman"/>
+        </w:rPr>
+        <w:t>Primena naučenog modela za generisanje maski za sve slike u klasifikacionom skupu. Generisane maske se zatim koriste za izolaciju regiona lezije pre prosleđivanja klasifikatoru.</w:t>
+      </w:r>
+    </w:p>
+    <w:p>
+      <w:pPr>
+        <w:rPr>
+          <w:rFonts w:ascii="Times New Roman" w:hAnsi="Times New Roman" w:cs="Times New Roman"/>
+        </w:rPr>
+      </w:pPr>
+    </w:p>
+    <w:p>
+      <w:pPr>
+        <w:spacing w:after="120" w:line="276" w:lineRule="auto"/>
+        <w:ind w:firstLine="720"/>
+        <w:jc w:val="both"/>
+        <w:rPr>
+          <w:rFonts w:ascii="Times New Roman" w:eastAsia="Times New Roman" w:hAnsi="Times New Roman" w:cs="Times New Roman"/>
+          <w:sz w:val="24"/>
+          <w:szCs w:val="24"/>
+        </w:rPr>
+      </w:pPr>
+      <w:r>
+        <w:rPr>
+          <w:rFonts w:ascii="Times New Roman" w:eastAsia="Times New Roman" w:hAnsi="Times New Roman" w:cs="Times New Roman"/>
+          <w:sz w:val="24"/>
+          <w:szCs w:val="24"/>
+        </w:rPr>
+        <w:t>Empirijski, U-Net postiže Dice koeficijent iznad 0.85 na standardnim dermoskopskim skupovima, što se smatra klinički prihvatljivim pragom za automatsku segmentaciju. Studije koje integrišu U-Net segmentaciju kao predobradni korak konzistentno beleže poboljšanje performansi klasifikatora, posebno za lezije sa slabim kontrastom prema okolnoj koži i atipično locirane lezije. Primarna ograničenja su računska složenost treniranja koja zahteva GPU resurse i ručno anotiran skup, propagacija greške jer netačna segmentacija direktno degradira ulaz klasifikatora, i potreba za zasebno kalibriranim modelom. [10]</w:t>
+      </w:r>
+    </w:p>
+    <w:p>
+      <w:pPr>
+        <w:rPr>
+          <w:rFonts w:ascii="Times New Roman" w:hAnsi="Times New Roman" w:cs="Times New Roman"/>
+        </w:rPr>
+      </w:pPr>
+    </w:p>
+    <w:p>
+      <w:pPr>
+        <w:pStyle w:val="Heading2"/>
+        <w:spacing w:line="276" w:lineRule="auto"/>
+        <w:rPr>
+          <w:rFonts w:ascii="Times New Roman" w:hAnsi="Times New Roman" w:cs="Times New Roman"/>
+        </w:rPr>
+      </w:pPr>
+      <w:r>
+        <w:rPr>
+          <w:rFonts w:ascii="Times New Roman" w:eastAsia="Times New Roman" w:hAnsi="Times New Roman" w:cs="Times New Roman"/>
+          <w:sz w:val="24"/>
+          <w:szCs w:val="24"/>
+        </w:rPr>
+        <w:t xml:space="preserve">4.2 EfficientNet </w:t>
+      </w:r>
+      <w:proofErr w:type="spellStart"/>
+      <w:r>
+        <w:rPr>
+          <w:rFonts w:ascii="Times New Roman" w:eastAsia="Times New Roman" w:hAnsi="Times New Roman" w:cs="Times New Roman"/>
+          <w:sz w:val="24"/>
+          <w:szCs w:val="24"/>
+        </w:rPr>
+        <w:t>arhitektura</w:t>
+      </w:r>
+      <w:proofErr w:type="spellEnd"/>
+      <w:r>
+        <w:rPr>
+          <w:rFonts w:ascii="Times New Roman" w:eastAsia="Times New Roman" w:hAnsi="Times New Roman" w:cs="Times New Roman"/>
+          <w:sz w:val="24"/>
+          <w:szCs w:val="24"/>
+        </w:rPr>
+        <w:t xml:space="preserve"> za </w:t>
+      </w:r>
+      <w:proofErr w:type="spellStart"/>
+      <w:r>
+        <w:rPr>
+          <w:rFonts w:ascii="Times New Roman" w:eastAsia="Times New Roman" w:hAnsi="Times New Roman" w:cs="Times New Roman"/>
+          <w:sz w:val="24"/>
+          <w:szCs w:val="24"/>
+        </w:rPr>
+        <w:t>klasifikaciju</w:t>
+      </w:r>
+      <w:proofErr w:type="spellEnd"/>
+      <w:r>
+        <w:rPr>
+          <w:rFonts w:ascii="Times New Roman" w:eastAsia="Times New Roman" w:hAnsi="Times New Roman" w:cs="Times New Roman"/>
+          <w:sz w:val="24"/>
+          <w:szCs w:val="24"/>
+        </w:rPr>
+        <w:t xml:space="preserve"> </w:t>
+      </w:r>
+      <w:proofErr w:type="spellStart"/>
+      <w:r>
+        <w:rPr>
+          <w:rFonts w:ascii="Times New Roman" w:eastAsia="Times New Roman" w:hAnsi="Times New Roman" w:cs="Times New Roman"/>
+          <w:sz w:val="24"/>
+          <w:szCs w:val="24"/>
+        </w:rPr>
+        <w:t>lezija</w:t>
+      </w:r>
+      <w:proofErr w:type="spellEnd"/>
+    </w:p>
+    <w:p>
+      <w:pPr>
+        <w:spacing w:after="120" w:line="276" w:lineRule="auto"/>
+        <w:ind w:firstLine="720"/>
+        <w:jc w:val="both"/>
+        <w:rPr>
+          <w:rFonts w:ascii="Times New Roman" w:eastAsia="Times New Roman" w:hAnsi="Times New Roman" w:cs="Times New Roman"/>
+          <w:sz w:val="24"/>
+          <w:szCs w:val="24"/>
+        </w:rPr>
+      </w:pPr>
+      <w:r>
+        <w:rPr>
+          <w:rFonts w:ascii="Times New Roman" w:eastAsia="Times New Roman" w:hAnsi="Times New Roman" w:cs="Times New Roman"/>
+          <w:sz w:val="24"/>
+          <w:szCs w:val="24"/>
+        </w:rPr>
+        <w:t>EfficientNet je familija konvolucionih neuronskih</w:t>
+      </w:r>
+      <w:r>
+        <w:rPr>
+          <w:rFonts w:ascii="Times New Roman" w:eastAsia="Times New Roman" w:hAnsi="Times New Roman" w:cs="Times New Roman"/>
+          <w:sz w:val="24"/>
+          <w:szCs w:val="24"/>
+        </w:rPr>
+        <w:t xml:space="preserve"> mreža</w:t>
+      </w:r>
+      <w:r>
+        <w:rPr>
+          <w:rFonts w:ascii="Times New Roman" w:eastAsia="Times New Roman" w:hAnsi="Times New Roman" w:cs="Times New Roman"/>
+          <w:sz w:val="24"/>
+          <w:szCs w:val="24"/>
+        </w:rPr>
+        <w:t xml:space="preserve"> koja uvodi sistematičan pristup skaliranju arhitekture. Umesto arbitrarnog povećavanja samo dubine, samo širine ili samo ulazne rezolucije, EfficientNet uniformno skalira sva tri dimenzije istovremeno koristeći jedinstven složeni koeficijent, označen sa fi. Ova arhitektura je posebno relevantna za dermatoskopiju jer njen mehanizam skaliranja direktno determiniše zahteve predobrade i optimalnu ulaznu rezoluciju za svaku varijantu.</w:t>
+      </w:r>
+    </w:p>
+    <w:p>
+      <w:pPr>
+        <w:jc w:val="center"/>
+        <w:rPr>
+          <w:rFonts w:ascii="Times New Roman" w:hAnsi="Times New Roman" w:cs="Times New Roman"/>
+        </w:rPr>
+      </w:pPr>
+      <w:r>
+        <w:rPr>
+          <w:rFonts w:ascii="Times New Roman" w:hAnsi="Times New Roman" w:cs="Times New Roman"/>
+        </w:rPr>
+        <w:drawing>
+          <wp:inline distT="0" distB="0" distL="0" distR="0" wp14:anchorId="3F601474" wp14:editId="75435C65">
+            <wp:extent cx="4162301" cy="2056693"/>
+            <wp:effectExtent l="0" t="0" r="0" b="1270"/>
+            <wp:docPr id="257728017" name="Picture 1"/>
+            <wp:cNvGraphicFramePr>
+              <a:graphicFrameLocks xmlns:a="http://schemas.openxmlformats.org/drawingml/2006/main" noChangeAspect="1"/>
+            </wp:cNvGraphicFramePr>
+            <a:graphic xmlns:a="http://schemas.openxmlformats.org/drawingml/2006/main">
+              <a:graphicData uri="http://schemas.openxmlformats.org/drawingml/2006/picture">
+                <pic:pic xmlns:pic="http://schemas.openxmlformats.org/drawingml/2006/picture">
+                  <pic:nvPicPr>
+                    <pic:cNvPr id="257728017" name=""/>
+                    <pic:cNvPicPr/>
+                  </pic:nvPicPr>
+                  <pic:blipFill>
+                    <a:blip r:embed="rId17"/>
+                    <a:stretch>
+                      <a:fillRect/>
+                    </a:stretch>
+                  </pic:blipFill>
+                  <pic:spPr>
+                    <a:xfrm>
+                      <a:off x="0" y="0"/>
+                      <a:ext cx="4180767" cy="2065817"/>
+                    </a:xfrm>
+                    <a:prstGeom prst="rect">
+                      <a:avLst/>
+                    </a:prstGeom>
+                  </pic:spPr>
+                </pic:pic>
+              </a:graphicData>
+            </a:graphic>
+          </wp:inline>
+        </w:drawing>
+      </w:r>
+    </w:p>
+    <w:p>
+      <w:pPr>
+        <w:spacing w:before="120" w:after="120" w:line="276" w:lineRule="auto"/>
+        <w:jc w:val="center"/>
+        <w:rPr>
+          <w:rFonts w:ascii="Times New Roman" w:hAnsi="Times New Roman" w:cs="Times New Roman"/>
+        </w:rPr>
+      </w:pPr>
+      <w:r>
+        <w:rPr>
+          <w:rFonts w:ascii="Times New Roman" w:eastAsia="Times New Roman" w:hAnsi="Times New Roman" w:cs="Times New Roman"/>
+          <w:sz w:val="24"/>
+          <w:szCs w:val="24"/>
+        </w:rPr>
+        <w:t>Slika 4.2.1 Compound scaling u EfficientNet arhitekturi: poređenje skaliranja samo po dubini, širini, rezoluciji i uniformnog compound scaling-a</w:t>
+      </w:r>
+    </w:p>
+    <w:p>
+      <w:pPr>
+        <w:rPr>
+          <w:rFonts w:ascii="Times New Roman" w:hAnsi="Times New Roman" w:cs="Times New Roman"/>
+        </w:rPr>
+      </w:pPr>
+    </w:p>
+    <w:p>
+      <w:pPr>
+        <w:spacing w:after="120" w:line="276" w:lineRule="auto"/>
+        <w:ind w:firstLine="720"/>
+        <w:jc w:val="both"/>
+        <w:rPr>
+          <w:rFonts w:ascii="Times New Roman" w:eastAsia="Times New Roman" w:hAnsi="Times New Roman" w:cs="Times New Roman"/>
+          <w:sz w:val="24"/>
+          <w:szCs w:val="24"/>
+        </w:rPr>
+      </w:pPr>
+      <w:r>
+        <w:rPr>
+          <w:rFonts w:ascii="Times New Roman" w:eastAsia="Times New Roman" w:hAnsi="Times New Roman" w:cs="Times New Roman"/>
+          <w:sz w:val="24"/>
+          <w:szCs w:val="24"/>
+        </w:rPr>
+        <w:t>Osnova familije je EfficientNet-B0, dobijena Neural Architecture Search (NAS) procesom koji optimizuje balans između tačnosti i računske cene. Skaliranje od B0 do B7 primenjuje složeni koeficijent fi koji kontroliše rast tri dimenzije prema empirijski određenim konstantama:</w:t>
+      </w:r>
+    </w:p>
+    <w:p>
+      <w:pPr>
+        <w:rPr>
+          <w:rFonts w:ascii="Times New Roman" w:hAnsi="Times New Roman" w:cs="Times New Roman"/>
+        </w:rPr>
+      </w:pPr>
+    </w:p>
+    <w:p>
+      <w:pPr>
+        <w:pStyle w:val="ListParagraph"/>
+        <w:numPr>
+          <w:ilvl w:val="0"/>
+          <w:numId w:val="29"/>
+        </w:numPr>
+        <w:spacing w:before="60" w:after="60" w:line="276" w:lineRule="auto"/>
+        <w:contextualSpacing w:val="0"/>
+        <w:jc w:val="both"/>
+        <w:rPr>
+          <w:rFonts w:ascii="Times New Roman" w:hAnsi="Times New Roman" w:cs="Times New Roman"/>
+        </w:rPr>
+      </w:pPr>
+      <w:r>
+        <w:rPr>
+          <w:rFonts w:ascii="Times New Roman" w:eastAsia="Times New Roman" w:hAnsi="Times New Roman" w:cs="Times New Roman"/>
+        </w:rPr>
+        <w:t xml:space="preserve">Dubina mreže (depth): d = alfa na fi, </w:t>
+      </w:r>
+      <w:proofErr w:type="spellStart"/>
+      <w:r>
+        <w:rPr>
+          <w:rFonts w:ascii="Times New Roman" w:eastAsia="Times New Roman" w:hAnsi="Times New Roman" w:cs="Times New Roman"/>
+        </w:rPr>
+        <w:t>gde</w:t>
+      </w:r>
+      <w:proofErr w:type="spellEnd"/>
+      <w:r>
+        <w:rPr>
+          <w:rFonts w:ascii="Times New Roman" w:eastAsia="Times New Roman" w:hAnsi="Times New Roman" w:cs="Times New Roman"/>
+        </w:rPr>
+        <w:t xml:space="preserve"> alfa </w:t>
+      </w:r>
+      <w:proofErr w:type="spellStart"/>
+      <w:r>
+        <w:rPr>
+          <w:rFonts w:ascii="Times New Roman" w:eastAsia="Times New Roman" w:hAnsi="Times New Roman" w:cs="Times New Roman"/>
+        </w:rPr>
+        <w:t>iznosi</w:t>
+      </w:r>
+      <w:proofErr w:type="spellEnd"/>
+      <w:r>
+        <w:rPr>
+          <w:rFonts w:ascii="Times New Roman" w:eastAsia="Times New Roman" w:hAnsi="Times New Roman" w:cs="Times New Roman"/>
+        </w:rPr>
+        <w:t xml:space="preserve"> 1.20</w:t>
+      </w:r>
+      <w:r>
+        <w:rPr>
+          <w:rFonts w:ascii="Times New Roman" w:eastAsia="Times New Roman" w:hAnsi="Times New Roman" w:cs="Times New Roman"/>
+        </w:rPr>
+        <w:t xml:space="preserve">, </w:t>
+      </w:r>
+      <w:proofErr w:type="spellStart"/>
+      <w:r>
+        <w:rPr>
+          <w:rFonts w:ascii="Times New Roman" w:eastAsia="Times New Roman" w:hAnsi="Times New Roman" w:cs="Times New Roman"/>
+        </w:rPr>
+        <w:t>mreža</w:t>
+      </w:r>
+      <w:proofErr w:type="spellEnd"/>
+      <w:r>
+        <w:rPr>
+          <w:rFonts w:ascii="Times New Roman" w:eastAsia="Times New Roman" w:hAnsi="Times New Roman" w:cs="Times New Roman"/>
+        </w:rPr>
+        <w:t xml:space="preserve"> </w:t>
+      </w:r>
+      <w:proofErr w:type="spellStart"/>
+      <w:r>
+        <w:rPr>
+          <w:rFonts w:ascii="Times New Roman" w:eastAsia="Times New Roman" w:hAnsi="Times New Roman" w:cs="Times New Roman"/>
+        </w:rPr>
+        <w:t>postaje</w:t>
+      </w:r>
+      <w:proofErr w:type="spellEnd"/>
+      <w:r>
+        <w:rPr>
+          <w:rFonts w:ascii="Times New Roman" w:eastAsia="Times New Roman" w:hAnsi="Times New Roman" w:cs="Times New Roman"/>
+        </w:rPr>
+        <w:t xml:space="preserve"> </w:t>
+      </w:r>
+      <w:proofErr w:type="spellStart"/>
+      <w:r>
+        <w:rPr>
+          <w:rFonts w:ascii="Times New Roman" w:eastAsia="Times New Roman" w:hAnsi="Times New Roman" w:cs="Times New Roman"/>
+        </w:rPr>
+        <w:t>progresivno</w:t>
+      </w:r>
+      <w:proofErr w:type="spellEnd"/>
+      <w:r>
+        <w:rPr>
+          <w:rFonts w:ascii="Times New Roman" w:eastAsia="Times New Roman" w:hAnsi="Times New Roman" w:cs="Times New Roman"/>
+        </w:rPr>
+        <w:t xml:space="preserve"> </w:t>
+      </w:r>
+      <w:proofErr w:type="spellStart"/>
+      <w:r>
+        <w:rPr>
+          <w:rFonts w:ascii="Times New Roman" w:eastAsia="Times New Roman" w:hAnsi="Times New Roman" w:cs="Times New Roman"/>
+        </w:rPr>
+        <w:t>dublja</w:t>
+      </w:r>
+      <w:proofErr w:type="spellEnd"/>
+      <w:r>
+        <w:rPr>
+          <w:rFonts w:ascii="Times New Roman" w:eastAsia="Times New Roman" w:hAnsi="Times New Roman" w:cs="Times New Roman"/>
+        </w:rPr>
+        <w:t xml:space="preserve">, </w:t>
+      </w:r>
+      <w:proofErr w:type="spellStart"/>
+      <w:r>
+        <w:rPr>
+          <w:rFonts w:ascii="Times New Roman" w:eastAsia="Times New Roman" w:hAnsi="Times New Roman" w:cs="Times New Roman"/>
+        </w:rPr>
+        <w:t>što</w:t>
+      </w:r>
+      <w:proofErr w:type="spellEnd"/>
+      <w:r>
+        <w:rPr>
+          <w:rFonts w:ascii="Times New Roman" w:eastAsia="Times New Roman" w:hAnsi="Times New Roman" w:cs="Times New Roman"/>
+        </w:rPr>
+        <w:t xml:space="preserve"> povećava apstraktnost naučenih reprezentacija.</w:t>
+      </w:r>
+    </w:p>
+    <w:p>
+      <w:pPr>
+        <w:pStyle w:val="ListParagraph"/>
+        <w:numPr>
+          <w:ilvl w:val="0"/>
+          <w:numId w:val="29"/>
+        </w:numPr>
+        <w:spacing w:before="60" w:after="60" w:line="276" w:lineRule="auto"/>
+        <w:contextualSpacing w:val="0"/>
+        <w:jc w:val="both"/>
+        <w:rPr>
+          <w:rFonts w:ascii="Times New Roman" w:hAnsi="Times New Roman" w:cs="Times New Roman"/>
+        </w:rPr>
+      </w:pPr>
+      <w:r>
+        <w:rPr>
+          <w:rFonts w:ascii="Times New Roman" w:eastAsia="Times New Roman" w:hAnsi="Times New Roman" w:cs="Times New Roman"/>
+        </w:rPr>
+        <w:t xml:space="preserve">Širina mreže (width): w = beta na fi, </w:t>
+      </w:r>
+      <w:proofErr w:type="spellStart"/>
+      <w:r>
+        <w:rPr>
+          <w:rFonts w:ascii="Times New Roman" w:eastAsia="Times New Roman" w:hAnsi="Times New Roman" w:cs="Times New Roman"/>
+        </w:rPr>
+        <w:t>gde</w:t>
+      </w:r>
+      <w:proofErr w:type="spellEnd"/>
+      <w:r>
+        <w:rPr>
+          <w:rFonts w:ascii="Times New Roman" w:eastAsia="Times New Roman" w:hAnsi="Times New Roman" w:cs="Times New Roman"/>
+        </w:rPr>
+        <w:t xml:space="preserve"> beta </w:t>
+      </w:r>
+      <w:proofErr w:type="spellStart"/>
+      <w:r>
+        <w:rPr>
+          <w:rFonts w:ascii="Times New Roman" w:eastAsia="Times New Roman" w:hAnsi="Times New Roman" w:cs="Times New Roman"/>
+        </w:rPr>
+        <w:t>iznosi</w:t>
+      </w:r>
+      <w:proofErr w:type="spellEnd"/>
+      <w:r>
+        <w:rPr>
+          <w:rFonts w:ascii="Times New Roman" w:eastAsia="Times New Roman" w:hAnsi="Times New Roman" w:cs="Times New Roman"/>
+        </w:rPr>
+        <w:t xml:space="preserve"> 1.10</w:t>
+      </w:r>
+      <w:r>
+        <w:rPr>
+          <w:rFonts w:ascii="Times New Roman" w:eastAsia="Times New Roman" w:hAnsi="Times New Roman" w:cs="Times New Roman"/>
+        </w:rPr>
+        <w:t>,</w:t>
+      </w:r>
+      <w:r>
+        <w:rPr>
+          <w:rFonts w:ascii="Times New Roman" w:eastAsia="Times New Roman" w:hAnsi="Times New Roman" w:cs="Times New Roman"/>
+        </w:rPr>
+        <w:t xml:space="preserve"> </w:t>
+      </w:r>
+      <w:proofErr w:type="spellStart"/>
+      <w:r>
+        <w:rPr>
+          <w:rFonts w:ascii="Times New Roman" w:eastAsia="Times New Roman" w:hAnsi="Times New Roman" w:cs="Times New Roman"/>
+        </w:rPr>
+        <w:t>više</w:t>
+      </w:r>
+      <w:proofErr w:type="spellEnd"/>
+      <w:r>
+        <w:rPr>
+          <w:rFonts w:ascii="Times New Roman" w:eastAsia="Times New Roman" w:hAnsi="Times New Roman" w:cs="Times New Roman"/>
+        </w:rPr>
+        <w:t xml:space="preserve"> </w:t>
+      </w:r>
+      <w:proofErr w:type="spellStart"/>
+      <w:r>
+        <w:rPr>
+          <w:rFonts w:ascii="Times New Roman" w:eastAsia="Times New Roman" w:hAnsi="Times New Roman" w:cs="Times New Roman"/>
+        </w:rPr>
+        <w:t>filtera</w:t>
+      </w:r>
+      <w:proofErr w:type="spellEnd"/>
+      <w:r>
+        <w:rPr>
+          <w:rFonts w:ascii="Times New Roman" w:eastAsia="Times New Roman" w:hAnsi="Times New Roman" w:cs="Times New Roman"/>
+        </w:rPr>
+        <w:t xml:space="preserve"> po konvolucionom sloju, čime raste kapacitet za učenje raznovrsnih karakteristika.</w:t>
+      </w:r>
+    </w:p>
+    <w:p>
+      <w:pPr>
+        <w:pStyle w:val="ListParagraph"/>
+        <w:numPr>
+          <w:ilvl w:val="0"/>
+          <w:numId w:val="29"/>
+        </w:numPr>
+        <w:spacing w:before="60" w:after="60" w:line="276" w:lineRule="auto"/>
+        <w:contextualSpacing w:val="0"/>
+        <w:jc w:val="both"/>
+        <w:rPr>
+          <w:rFonts w:ascii="Times New Roman" w:hAnsi="Times New Roman" w:cs="Times New Roman"/>
+        </w:rPr>
+      </w:pPr>
+      <w:r>
+        <w:rPr>
+          <w:rFonts w:ascii="Times New Roman" w:eastAsia="Times New Roman" w:hAnsi="Times New Roman" w:cs="Times New Roman"/>
+        </w:rPr>
+        <w:t xml:space="preserve">Ulazna rezolucija (resolution): r = gama na fi, </w:t>
+      </w:r>
+      <w:proofErr w:type="spellStart"/>
+      <w:r>
+        <w:rPr>
+          <w:rFonts w:ascii="Times New Roman" w:eastAsia="Times New Roman" w:hAnsi="Times New Roman" w:cs="Times New Roman"/>
+        </w:rPr>
+        <w:t>gde</w:t>
+      </w:r>
+      <w:proofErr w:type="spellEnd"/>
+      <w:r>
+        <w:rPr>
+          <w:rFonts w:ascii="Times New Roman" w:eastAsia="Times New Roman" w:hAnsi="Times New Roman" w:cs="Times New Roman"/>
+        </w:rPr>
+        <w:t xml:space="preserve"> gama </w:t>
+      </w:r>
+      <w:proofErr w:type="spellStart"/>
+      <w:r>
+        <w:rPr>
+          <w:rFonts w:ascii="Times New Roman" w:eastAsia="Times New Roman" w:hAnsi="Times New Roman" w:cs="Times New Roman"/>
+        </w:rPr>
+        <w:t>iznosi</w:t>
+      </w:r>
+      <w:proofErr w:type="spellEnd"/>
+      <w:r>
+        <w:rPr>
+          <w:rFonts w:ascii="Times New Roman" w:eastAsia="Times New Roman" w:hAnsi="Times New Roman" w:cs="Times New Roman"/>
+        </w:rPr>
+        <w:t xml:space="preserve"> 1.15</w:t>
+      </w:r>
+      <w:r>
+        <w:rPr>
+          <w:rFonts w:ascii="Times New Roman" w:eastAsia="Times New Roman" w:hAnsi="Times New Roman" w:cs="Times New Roman"/>
+        </w:rPr>
+        <w:t>,</w:t>
+      </w:r>
+      <w:r>
+        <w:rPr>
+          <w:rFonts w:ascii="Times New Roman" w:eastAsia="Times New Roman" w:hAnsi="Times New Roman" w:cs="Times New Roman"/>
+        </w:rPr>
+        <w:t xml:space="preserve"> </w:t>
+      </w:r>
+      <w:proofErr w:type="spellStart"/>
+      <w:r>
+        <w:rPr>
+          <w:rFonts w:ascii="Times New Roman" w:eastAsia="Times New Roman" w:hAnsi="Times New Roman" w:cs="Times New Roman"/>
+        </w:rPr>
+        <w:t>veće</w:t>
+      </w:r>
+      <w:proofErr w:type="spellEnd"/>
+      <w:r>
+        <w:rPr>
+          <w:rFonts w:ascii="Times New Roman" w:eastAsia="Times New Roman" w:hAnsi="Times New Roman" w:cs="Times New Roman"/>
+        </w:rPr>
+        <w:t xml:space="preserve"> </w:t>
+      </w:r>
+      <w:proofErr w:type="spellStart"/>
+      <w:r>
+        <w:rPr>
+          <w:rFonts w:ascii="Times New Roman" w:eastAsia="Times New Roman" w:hAnsi="Times New Roman" w:cs="Times New Roman"/>
+        </w:rPr>
+        <w:t>ulazne</w:t>
+      </w:r>
+      <w:proofErr w:type="spellEnd"/>
+      <w:r>
+        <w:rPr>
+          <w:rFonts w:ascii="Times New Roman" w:eastAsia="Times New Roman" w:hAnsi="Times New Roman" w:cs="Times New Roman"/>
+        </w:rPr>
+        <w:t xml:space="preserve"> </w:t>
+      </w:r>
+      <w:proofErr w:type="spellStart"/>
+      <w:r>
+        <w:rPr>
+          <w:rFonts w:ascii="Times New Roman" w:eastAsia="Times New Roman" w:hAnsi="Times New Roman" w:cs="Times New Roman"/>
+        </w:rPr>
+        <w:t>slike</w:t>
+      </w:r>
+      <w:proofErr w:type="spellEnd"/>
+      <w:r>
+        <w:rPr>
+          <w:rFonts w:ascii="Times New Roman" w:eastAsia="Times New Roman" w:hAnsi="Times New Roman" w:cs="Times New Roman"/>
+        </w:rPr>
+        <w:t xml:space="preserve"> omogućavaju mreži da obrađuje finozrnate vizuelne detalje. Za EfficientNet-B4 ulazna rezolucija je 380x380, a za B5 iznosi 456x456 piksela.</w:t>
+      </w:r>
+    </w:p>
+    <w:p>
+      <w:pPr>
+        <w:rPr>
+          <w:rFonts w:ascii="Times New Roman" w:hAnsi="Times New Roman" w:cs="Times New Roman"/>
+        </w:rPr>
+      </w:pPr>
+    </w:p>
+    <w:p>
+      <w:pPr>
+        <w:spacing w:after="120" w:line="276" w:lineRule="auto"/>
+        <w:ind w:firstLine="720"/>
+        <w:jc w:val="both"/>
+        <w:rPr>
+          <w:rFonts w:ascii="Times New Roman" w:eastAsia="Times New Roman" w:hAnsi="Times New Roman" w:cs="Times New Roman"/>
+          <w:sz w:val="24"/>
+          <w:szCs w:val="24"/>
+        </w:rPr>
+      </w:pPr>
+      <w:r>
+        <w:rPr>
+          <w:rFonts w:ascii="Times New Roman" w:eastAsia="Times New Roman" w:hAnsi="Times New Roman" w:cs="Times New Roman"/>
+          <w:sz w:val="24"/>
+          <w:szCs w:val="24"/>
+        </w:rPr>
+        <w:t>Što se tiče arhitektonskih blokova, EfficientNet koristi MBConv (Mobile Inverted Bottleneck Convolution) blokove obogaćene Squeeze-and-Excitation (SE) modulom. SE modul uči da kalibriše važnost svakog feature mapa kroz mehanizam kanalske pažnje: najpre skuplja globalnu prostornu informaciju svakog kanala globalnim prosečnim poolingom, zatim kroz dve FC projekcije uči težine kojima skalira svaki kanal zasebno. Ovo je posebno korisno u dermoskopiji gde su dijagnostički relevantne mikrostrukture kao što su pigmentne mreže, globule i regresivne strukture, lokalizovane i fine.</w:t>
+      </w:r>
+    </w:p>
+    <w:p>
+      <w:pPr>
+        <w:jc w:val="center"/>
+        <w:rPr>
+          <w:rFonts w:ascii="Times New Roman" w:hAnsi="Times New Roman" w:cs="Times New Roman"/>
+        </w:rPr>
+      </w:pPr>
+      <w:r>
+        <w:rPr>
+          <w:rFonts w:ascii="Times New Roman" w:hAnsi="Times New Roman" w:cs="Times New Roman"/>
+        </w:rPr>
+        <w:drawing>
+          <wp:inline distT="0" distB="0" distL="0" distR="0" wp14:anchorId="4EDADFE9" wp14:editId="72C1C764">
+            <wp:extent cx="4916384" cy="3058558"/>
+            <wp:effectExtent l="0" t="0" r="0" b="8890"/>
+            <wp:docPr id="1629797518" name="Picture 1"/>
+            <wp:cNvGraphicFramePr>
+              <a:graphicFrameLocks xmlns:a="http://schemas.openxmlformats.org/drawingml/2006/main" noChangeAspect="1"/>
+            </wp:cNvGraphicFramePr>
+            <a:graphic xmlns:a="http://schemas.openxmlformats.org/drawingml/2006/main">
+              <a:graphicData uri="http://schemas.openxmlformats.org/drawingml/2006/picture">
+                <pic:pic xmlns:pic="http://schemas.openxmlformats.org/drawingml/2006/picture">
+                  <pic:nvPicPr>
+                    <pic:cNvPr id="1629797518" name=""/>
+                    <pic:cNvPicPr/>
+                  </pic:nvPicPr>
+                  <pic:blipFill>
+                    <a:blip r:embed="rId18"/>
+                    <a:stretch>
+                      <a:fillRect/>
+                    </a:stretch>
+                  </pic:blipFill>
+                  <pic:spPr>
+                    <a:xfrm>
+                      <a:off x="0" y="0"/>
+                      <a:ext cx="4923699" cy="3063109"/>
+                    </a:xfrm>
+                    <a:prstGeom prst="rect">
+                      <a:avLst/>
+                    </a:prstGeom>
+                  </pic:spPr>
+                </pic:pic>
+              </a:graphicData>
+            </a:graphic>
+          </wp:inline>
+        </w:drawing>
+      </w:r>
+    </w:p>
+    <w:p>
+      <w:pPr>
+        <w:spacing w:before="120" w:after="120" w:line="276" w:lineRule="auto"/>
+        <w:jc w:val="center"/>
+        <w:rPr>
+          <w:rFonts w:ascii="Times New Roman" w:hAnsi="Times New Roman" w:cs="Times New Roman"/>
+        </w:rPr>
+      </w:pPr>
+      <w:r>
+        <w:rPr>
+          <w:rFonts w:ascii="Times New Roman" w:eastAsia="Times New Roman" w:hAnsi="Times New Roman" w:cs="Times New Roman"/>
+          <w:sz w:val="24"/>
+          <w:szCs w:val="24"/>
+        </w:rPr>
+        <w:t>Slika 4.2.2 MBConv blok sa Squeeze-and-Excitation modulom</w:t>
+      </w:r>
+      <w:r>
+        <w:rPr>
+          <w:rFonts w:ascii="Times New Roman" w:eastAsia="Times New Roman" w:hAnsi="Times New Roman" w:cs="Times New Roman"/>
+          <w:sz w:val="24"/>
+          <w:szCs w:val="24"/>
+        </w:rPr>
+        <w:t>,</w:t>
+      </w:r>
+      <w:r>
+        <w:rPr>
+          <w:rFonts w:ascii="Times New Roman" w:eastAsia="Times New Roman" w:hAnsi="Times New Roman" w:cs="Times New Roman"/>
+          <w:sz w:val="24"/>
+          <w:szCs w:val="24"/>
+        </w:rPr>
+        <w:t xml:space="preserve"> osnovna arhitektonska jedinica EfficientNet mreže</w:t>
+      </w:r>
+    </w:p>
+    <w:p>
+      <w:pPr>
+        <w:rPr>
+          <w:rFonts w:ascii="Times New Roman" w:hAnsi="Times New Roman" w:cs="Times New Roman"/>
+        </w:rPr>
+      </w:pPr>
+    </w:p>
+    <w:p>
+      <w:pPr>
+        <w:spacing w:after="120" w:line="276" w:lineRule="auto"/>
+        <w:ind w:firstLine="720"/>
+        <w:jc w:val="both"/>
+        <w:rPr>
+          <w:rFonts w:ascii="Times New Roman" w:eastAsia="Times New Roman" w:hAnsi="Times New Roman" w:cs="Times New Roman"/>
+          <w:sz w:val="24"/>
+          <w:szCs w:val="24"/>
+        </w:rPr>
+      </w:pPr>
+      <w:r>
+        <w:rPr>
+          <w:rFonts w:ascii="Times New Roman" w:eastAsia="Times New Roman" w:hAnsi="Times New Roman" w:cs="Times New Roman"/>
+          <w:sz w:val="24"/>
+          <w:szCs w:val="24"/>
+        </w:rPr>
+        <w:t>U kontekstu predobrade, relevantnost EfficientNet arhitekture je višestruka. Transfer learning sa ImageNet prethodno naučenim težinama zahteva specifičnu normalizaciju ulaza: srednje vrednosti po kanalima su 0.485, 0.456 i 0.406, a standardne devijacije 0.229, 0.224 i 0.225 u RGB redu, što odgovara statistikama ImageNet dataseta. Ova normalizacija je obavezan predobradni korak koji mora biti primenjen identično u fazi treniranja i inferencije — odstupanje između dve faze direktno degradira performanse modela.</w:t>
+      </w:r>
+    </w:p>
+    <w:p>
+      <w:pPr>
+        <w:spacing w:after="120" w:line="276" w:lineRule="auto"/>
+        <w:ind w:firstLine="720"/>
+        <w:jc w:val="both"/>
+        <w:rPr>
+          <w:rFonts w:ascii="Times New Roman" w:eastAsia="Times New Roman" w:hAnsi="Times New Roman" w:cs="Times New Roman"/>
+          <w:sz w:val="24"/>
+          <w:szCs w:val="24"/>
+        </w:rPr>
+      </w:pPr>
+    </w:p>
+    <w:p>
+      <w:pPr>
+        <w:spacing w:after="120" w:line="276" w:lineRule="auto"/>
+        <w:ind w:firstLine="720"/>
+        <w:jc w:val="both"/>
+        <w:rPr>
+          <w:rFonts w:ascii="Times New Roman" w:eastAsia="Times New Roman" w:hAnsi="Times New Roman" w:cs="Times New Roman"/>
+          <w:sz w:val="24"/>
+          <w:szCs w:val="24"/>
+        </w:rPr>
+      </w:pPr>
+      <w:r>
+        <w:rPr>
+          <w:rFonts w:ascii="Times New Roman" w:eastAsia="Times New Roman" w:hAnsi="Times New Roman" w:cs="Times New Roman"/>
+          <w:sz w:val="24"/>
+          <w:szCs w:val="24"/>
+        </w:rPr>
+        <w:t>Ulazna rezolucija mora biti usklađena sa arhitektonskim zahtevom odabrane varijante, što znači da resize operacija mora biti pažljivo izvršena kako bi se sačuvali dijagnostički relevantni detalji. Na HAM10000 datasetu čije slike imaju prirodnu rezoluciju 600x450, EfficientNet-B4 sa rezolucijom 380x380 je tipično optimalan izbor jer ne zahteva uvećanje izvan prirodne rezolucije snimka, dok B5 i veće varijante povećavaju računski cost bez proporcionalnog dobitka u tačnosti.</w:t>
+      </w:r>
+    </w:p>
+    <w:p>
+      <w:pPr>
+        <w:rPr>
+          <w:rFonts w:ascii="Times New Roman" w:hAnsi="Times New Roman" w:cs="Times New Roman"/>
+        </w:rPr>
+      </w:pPr>
+    </w:p>
+    <w:p>
+      <w:pPr>
+        <w:spacing w:after="120" w:line="276" w:lineRule="auto"/>
+        <w:ind w:firstLine="720"/>
+        <w:jc w:val="both"/>
+        <w:rPr>
+          <w:rFonts w:ascii="Times New Roman" w:eastAsia="Times New Roman" w:hAnsi="Times New Roman" w:cs="Times New Roman"/>
+          <w:sz w:val="24"/>
+          <w:szCs w:val="24"/>
+        </w:rPr>
+      </w:pPr>
+      <w:r>
+        <w:rPr>
+          <w:rFonts w:ascii="Times New Roman" w:eastAsia="Times New Roman" w:hAnsi="Times New Roman" w:cs="Times New Roman"/>
+          <w:sz w:val="24"/>
+          <w:szCs w:val="24"/>
+        </w:rPr>
+        <w:t>Studije na HAM10000 datasetu pokazuju da EfficientNet-B4 i B5 varijante konzistentno nadmašuju VGG i ranije ResNet arhitekture pri jednakim uslovima predobrade, uz manji broj parametara. Kombinacija CLAHE predobrade, uklanjanja dlaka i augmentacijom balansiranog skupa sa EfficientNet-B4 dostiže balanced accuracy iznad 85% na 7-klasnom HAM10000 problemu, što je rezultat nedostupan ranijim CNN arhitekturama bez ovako optimizovanog predobradnog pipeline-a. [2, 9]</w:t>
+      </w:r>
+    </w:p>
+    <w:p>
+      <w:pPr>
+        <w:spacing w:line="278" w:lineRule="auto"/>
+        <w:rPr>
+          <w:rFonts w:ascii="Times New Roman" w:hAnsi="Times New Roman" w:cs="Times New Roman"/>
+          <w:lang w:val="en-US"/>
+        </w:rPr>
+      </w:pPr>
+      <w:r>
+        <w:rPr>
+          <w:rFonts w:ascii="Times New Roman" w:hAnsi="Times New Roman" w:cs="Times New Roman"/>
+        </w:rPr>
+        <w:br w:type="page"/>
+      </w:r>
+    </w:p>
+    <w:p>
+      <w:pPr>
+        <w:pStyle w:val="Heading1"/>
+        <w:spacing w:line="276" w:lineRule="auto"/>
+        <w:rPr>
+          <w:rFonts w:ascii="Times New Roman" w:hAnsi="Times New Roman" w:cs="Times New Roman"/>
           <w:lang w:val="sr-Latn-RS"/>
         </w:rPr>
       </w:pPr>
       <w:r>
+        <w:rPr>
+          <w:rFonts w:ascii="Times New Roman" w:hAnsi="Times New Roman" w:cs="Times New Roman"/>
+        </w:rPr>
         <w:lastRenderedPageBreak/>
-        <w:t xml:space="preserve">4 </w:t>
-      </w:r>
-      <w:proofErr w:type="spellStart"/>
-      <w:r>
+        <w:t xml:space="preserve">5 </w:t>
+      </w:r>
+      <w:proofErr w:type="spellStart"/>
+      <w:r>
+        <w:rPr>
+          <w:rFonts w:ascii="Times New Roman" w:hAnsi="Times New Roman" w:cs="Times New Roman"/>
+        </w:rPr>
         <w:t>Zaklju</w:t>
       </w:r>
       <w:proofErr w:type="spellEnd"/>
       <w:r>
         <w:rPr>
+          <w:rFonts w:ascii="Times New Roman" w:hAnsi="Times New Roman" w:cs="Times New Roman"/>
           <w:lang w:val="sr-Latn-RS"/>
         </w:rPr>
         <w:t>čak</w:t>
@@ -22931,6 +24367,9 @@
         </w:rPr>
       </w:pPr>
       <w:r>
+        <w:rPr>
+          <w:rFonts w:ascii="Times New Roman" w:hAnsi="Times New Roman" w:cs="Times New Roman"/>
+        </w:rPr>
         <w:tab/>
       </w:r>
       <w:r>
@@ -22959,6 +24398,7 @@
           <w:szCs w:val="24"/>
         </w:rPr>
         <w:tab/>
+        <w:t xml:space="preserve">Centralni zaključak rada je da je predobrada slike neophodan, a ne opcioni korak u pipeline-u za klasifikaciju kožnih lezija. Svi analizirani visoko-performantni sistemi na HAM10000 koriste višefazne predobradne pipeline-ove koji kombinuju poboljšanje kontrasta (CLAHE), uklanjanje artefakata i strateško balansiranje klasa. Razlika u performansama između bazičnog pipeline-a (samo resize i normalizacija) i optimalnog pipeline-a može biti i do 10-15 </w:t>
       </w:r>
       <w:r>
         <w:rPr>
@@ -22966,7 +24406,7 @@
           <w:sz w:val="24"/>
           <w:szCs w:val="24"/>
         </w:rPr>
-        <w:t xml:space="preserve">Centralni zaključak rada je da je predobrada slike neophodan, a ne opcioni korak u pipeline-u za klasifikaciju kožnih lezija. Svi analizirani visoko-performantni sistemi na HAM10000 koriste višefazne predobradne pipeline-ove koji kombinuju poboljšanje kontrasta (CLAHE), uklanjanje artefakata i strateško balansiranje klasa. Razlika u performansama između bazičnog pipeline-a (samo resize i normalizacija) i optimalnog pipeline-a može biti i do 10-15 </w:t>
+        <w:t>procenata</w:t>
       </w:r>
       <w:r>
         <w:rPr>
@@ -22974,44 +24414,32 @@
           <w:sz w:val="24"/>
           <w:szCs w:val="24"/>
         </w:rPr>
-        <w:t>procenata</w:t>
-      </w:r>
-      <w:r>
+        <w:t xml:space="preserve"> u tačnosti i značajno veća u recall-u za retke klase poput melanoma.</w:t>
+      </w:r>
+    </w:p>
+    <w:p>
+      <w:pPr>
+        <w:spacing w:after="120" w:line="276" w:lineRule="auto"/>
+        <w:jc w:val="both"/>
         <w:rPr>
           <w:rFonts w:ascii="Times New Roman" w:eastAsia="Times New Roman" w:hAnsi="Times New Roman" w:cs="Times New Roman"/>
           <w:sz w:val="24"/>
           <w:szCs w:val="24"/>
         </w:rPr>
-        <w:t xml:space="preserve"> u tačnosti i značajno veća u recall-u za retke klase poput melanoma.</w:t>
-      </w:r>
-    </w:p>
-    <w:p>
-      <w:pPr>
-        <w:spacing w:after="120" w:line="276" w:lineRule="auto"/>
-        <w:jc w:val="both"/>
+      </w:pPr>
+      <w:r>
         <w:rPr>
           <w:rFonts w:ascii="Times New Roman" w:eastAsia="Times New Roman" w:hAnsi="Times New Roman" w:cs="Times New Roman"/>
           <w:sz w:val="24"/>
           <w:szCs w:val="24"/>
         </w:rPr>
-      </w:pPr>
-      <w:r>
-        <w:rPr>
-          <w:rFonts w:ascii="Times New Roman" w:eastAsia="Times New Roman" w:hAnsi="Times New Roman" w:cs="Times New Roman"/>
-          <w:sz w:val="24"/>
-          <w:szCs w:val="24"/>
-        </w:rPr>
         <w:tab/>
-      </w:r>
-      <w:r>
-        <w:rPr>
-          <w:rFonts w:ascii="Times New Roman" w:eastAsia="Times New Roman" w:hAnsi="Times New Roman" w:cs="Times New Roman"/>
-          <w:sz w:val="24"/>
-          <w:szCs w:val="24"/>
-        </w:rPr>
         <w:t>Jednostavno rečeno, model je onoliko dobar koliko su dobri podaci na kojima uči. Dermatoskopska slika puna dlaka, slabog kontrasta i neravnomernog osvetljenja ne nosi isti dijagnostički signal kao slika koja je prošla kroz CLAHE, uklanjanje artefakata i adekvatnu normalizaciju — čak i ako je u pitanju ista lezija istog pacijenta. Predobrada ne menja dijagnozu, ali menja sposobnost modela da je prepozna. U domenu gde pogrešna klasifikacija može značiti propušten melanom, ta razlika nije samo statistička već i klinička.</w:t>
       </w:r>
       <w:r>
+        <w:rPr>
+          <w:rFonts w:ascii="Times New Roman" w:hAnsi="Times New Roman" w:cs="Times New Roman"/>
+        </w:rPr>
         <w:br w:type="page"/>
       </w:r>
     </w:p>
@@ -23031,7 +24459,7 @@
           <w:lang w:val="sr-Latn-RS"/>
         </w:rPr>
         <w:lastRenderedPageBreak/>
-        <w:t xml:space="preserve">5 </w:t>
+        <w:t xml:space="preserve">6 </w:t>
       </w:r>
       <w:r>
         <w:rPr>
@@ -23046,6 +24474,9 @@
       <w:pPr>
         <w:spacing w:before="60" w:after="60" w:line="276" w:lineRule="auto"/>
         <w:ind w:left="720" w:hanging="720"/>
+        <w:rPr>
+          <w:rFonts w:ascii="Times New Roman" w:hAnsi="Times New Roman" w:cs="Times New Roman"/>
+        </w:rPr>
       </w:pPr>
       <w:r>
         <w:rPr>
@@ -23058,6 +24489,9 @@
       <w:pPr>
         <w:spacing w:before="60" w:after="60" w:line="276" w:lineRule="auto"/>
         <w:ind w:left="720" w:hanging="720"/>
+        <w:rPr>
+          <w:rFonts w:ascii="Times New Roman" w:hAnsi="Times New Roman" w:cs="Times New Roman"/>
+        </w:rPr>
       </w:pPr>
       <w:r>
         <w:rPr>
@@ -23070,6 +24504,9 @@
       <w:pPr>
         <w:spacing w:before="60" w:after="60" w:line="276" w:lineRule="auto"/>
         <w:ind w:left="720" w:hanging="720"/>
+        <w:rPr>
+          <w:rFonts w:ascii="Times New Roman" w:hAnsi="Times New Roman" w:cs="Times New Roman"/>
+        </w:rPr>
       </w:pPr>
       <w:r>
         <w:rPr>
@@ -23082,6 +24519,9 @@
       <w:pPr>
         <w:spacing w:before="60" w:after="60" w:line="276" w:lineRule="auto"/>
         <w:ind w:left="720" w:hanging="720"/>
+        <w:rPr>
+          <w:rFonts w:ascii="Times New Roman" w:hAnsi="Times New Roman" w:cs="Times New Roman"/>
+        </w:rPr>
       </w:pPr>
       <w:r>
         <w:rPr>
@@ -23094,6 +24534,9 @@
       <w:pPr>
         <w:spacing w:before="60" w:after="60" w:line="276" w:lineRule="auto"/>
         <w:ind w:left="720" w:hanging="720"/>
+        <w:rPr>
+          <w:rFonts w:ascii="Times New Roman" w:hAnsi="Times New Roman" w:cs="Times New Roman"/>
+        </w:rPr>
       </w:pPr>
       <w:r>
         <w:rPr>
@@ -23106,6 +24549,9 @@
       <w:pPr>
         <w:spacing w:before="60" w:after="60" w:line="276" w:lineRule="auto"/>
         <w:ind w:left="720" w:hanging="720"/>
+        <w:rPr>
+          <w:rFonts w:ascii="Times New Roman" w:hAnsi="Times New Roman" w:cs="Times New Roman"/>
+        </w:rPr>
       </w:pPr>
       <w:r>
         <w:rPr>
@@ -23118,6 +24564,9 @@
       <w:pPr>
         <w:spacing w:before="60" w:after="60" w:line="276" w:lineRule="auto"/>
         <w:ind w:left="720" w:hanging="720"/>
+        <w:rPr>
+          <w:rFonts w:ascii="Times New Roman" w:hAnsi="Times New Roman" w:cs="Times New Roman"/>
+        </w:rPr>
       </w:pPr>
       <w:r>
         <w:rPr>
@@ -23130,6 +24579,9 @@
       <w:pPr>
         <w:spacing w:before="60" w:after="60" w:line="276" w:lineRule="auto"/>
         <w:ind w:left="720" w:hanging="720"/>
+        <w:rPr>
+          <w:rFonts w:ascii="Times New Roman" w:hAnsi="Times New Roman" w:cs="Times New Roman"/>
+        </w:rPr>
       </w:pPr>
       <w:r>
         <w:rPr>
@@ -23142,6 +24594,9 @@
       <w:pPr>
         <w:spacing w:before="60" w:after="60" w:line="276" w:lineRule="auto"/>
         <w:ind w:left="720" w:hanging="720"/>
+        <w:rPr>
+          <w:rFonts w:ascii="Times New Roman" w:hAnsi="Times New Roman" w:cs="Times New Roman"/>
+        </w:rPr>
       </w:pPr>
       <w:r>
         <w:rPr>
@@ -23154,6 +24609,9 @@
       <w:pPr>
         <w:spacing w:before="60" w:after="60" w:line="276" w:lineRule="auto"/>
         <w:ind w:left="720" w:hanging="720"/>
+        <w:rPr>
+          <w:rFonts w:ascii="Times New Roman" w:hAnsi="Times New Roman" w:cs="Times New Roman"/>
+        </w:rPr>
       </w:pPr>
       <w:r>
         <w:rPr>
@@ -23166,6 +24624,9 @@
       <w:pPr>
         <w:spacing w:before="60" w:after="60" w:line="276" w:lineRule="auto"/>
         <w:ind w:left="720" w:hanging="720"/>
+        <w:rPr>
+          <w:rFonts w:ascii="Times New Roman" w:hAnsi="Times New Roman" w:cs="Times New Roman"/>
+        </w:rPr>
       </w:pPr>
       <w:r>
         <w:rPr>
@@ -23178,6 +24639,9 @@
       <w:pPr>
         <w:spacing w:before="60" w:after="60" w:line="276" w:lineRule="auto"/>
         <w:ind w:left="720" w:hanging="720"/>
+        <w:rPr>
+          <w:rFonts w:ascii="Times New Roman" w:hAnsi="Times New Roman" w:cs="Times New Roman"/>
+        </w:rPr>
       </w:pPr>
       <w:r>
         <w:rPr>
@@ -23190,6 +24654,9 @@
       <w:pPr>
         <w:spacing w:before="60" w:after="60" w:line="276" w:lineRule="auto"/>
         <w:ind w:left="720" w:hanging="720"/>
+        <w:rPr>
+          <w:rFonts w:ascii="Times New Roman" w:hAnsi="Times New Roman" w:cs="Times New Roman"/>
+        </w:rPr>
       </w:pPr>
       <w:r>
         <w:rPr>
@@ -23202,6 +24669,9 @@
       <w:pPr>
         <w:spacing w:before="60" w:after="60" w:line="276" w:lineRule="auto"/>
         <w:ind w:left="720" w:hanging="720"/>
+        <w:rPr>
+          <w:rFonts w:ascii="Times New Roman" w:hAnsi="Times New Roman" w:cs="Times New Roman"/>
+        </w:rPr>
       </w:pPr>
       <w:r>
         <w:rPr>
@@ -23214,6 +24684,9 @@
       <w:pPr>
         <w:spacing w:before="60" w:after="60" w:line="276" w:lineRule="auto"/>
         <w:ind w:left="720" w:hanging="720"/>
+        <w:rPr>
+          <w:rFonts w:ascii="Times New Roman" w:hAnsi="Times New Roman" w:cs="Times New Roman"/>
+        </w:rPr>
       </w:pPr>
       <w:r>
         <w:rPr>
@@ -23226,6 +24699,9 @@
       <w:pPr>
         <w:spacing w:before="60" w:after="60" w:line="276" w:lineRule="auto"/>
         <w:ind w:left="720" w:hanging="720"/>
+        <w:rPr>
+          <w:rFonts w:ascii="Times New Roman" w:hAnsi="Times New Roman" w:cs="Times New Roman"/>
+        </w:rPr>
       </w:pPr>
       <w:r>
         <w:rPr>
@@ -23238,6 +24714,9 @@
       <w:pPr>
         <w:spacing w:before="60" w:after="60" w:line="276" w:lineRule="auto"/>
         <w:ind w:left="720" w:hanging="720"/>
+        <w:rPr>
+          <w:rFonts w:ascii="Times New Roman" w:hAnsi="Times New Roman" w:cs="Times New Roman"/>
+        </w:rPr>
       </w:pPr>
       <w:r>
         <w:rPr>
@@ -23250,6 +24729,9 @@
       <w:pPr>
         <w:spacing w:before="60" w:after="60" w:line="276" w:lineRule="auto"/>
         <w:ind w:left="720" w:hanging="720"/>
+        <w:rPr>
+          <w:rFonts w:ascii="Times New Roman" w:hAnsi="Times New Roman" w:cs="Times New Roman"/>
+        </w:rPr>
       </w:pPr>
       <w:r>
         <w:rPr>
@@ -23393,6 +24875,92 @@
     </w:lvl>
   </w:abstractNum>
   <w:abstractNum w:abstractNumId="1" w15:restartNumberingAfterBreak="0">
+    <w:nsid w:val="194F2D0D"/>
+    <w:multiLevelType w:val="hybridMultilevel"/>
+    <w:tmpl w:val="05D4DE6E"/>
+    <w:lvl w:ilvl="0" w:tplc="FFFFFFFF">
+      <w:start w:val="1"/>
+      <w:numFmt w:val="decimal"/>
+      <w:lvlText w:val="%1."/>
+      <w:lvlJc w:val="left"/>
+      <w:pPr>
+        <w:ind w:left="720" w:hanging="360"/>
+      </w:pPr>
+    </w:lvl>
+    <w:lvl w:ilvl="1" w:tplc="FFFFFFFF">
+      <w:start w:val="1"/>
+      <w:numFmt w:val="lowerLetter"/>
+      <w:lvlText w:val="%2."/>
+      <w:lvlJc w:val="left"/>
+      <w:pPr>
+        <w:ind w:left="1440" w:hanging="360"/>
+      </w:pPr>
+    </w:lvl>
+    <w:lvl w:ilvl="2" w:tplc="FFFFFFFF" w:tentative="1">
+      <w:start w:val="1"/>
+      <w:numFmt w:val="lowerRoman"/>
+      <w:lvlText w:val="%3."/>
+      <w:lvlJc w:val="right"/>
+      <w:pPr>
+        <w:ind w:left="2160" w:hanging="180"/>
+      </w:pPr>
+    </w:lvl>
+    <w:lvl w:ilvl="3" w:tplc="FFFFFFFF" w:tentative="1">
+      <w:start w:val="1"/>
+      <w:numFmt w:val="decimal"/>
+      <w:lvlText w:val="%4."/>
+      <w:lvlJc w:val="left"/>
+      <w:pPr>
+        <w:ind w:left="2880" w:hanging="360"/>
+      </w:pPr>
+    </w:lvl>
+    <w:lvl w:ilvl="4" w:tplc="FFFFFFFF" w:tentative="1">
+      <w:start w:val="1"/>
+      <w:numFmt w:val="lowerLetter"/>
+      <w:lvlText w:val="%5."/>
+      <w:lvlJc w:val="left"/>
+      <w:pPr>
+        <w:ind w:left="3600" w:hanging="360"/>
+      </w:pPr>
+    </w:lvl>
+    <w:lvl w:ilvl="5" w:tplc="FFFFFFFF" w:tentative="1">
+      <w:start w:val="1"/>
+      <w:numFmt w:val="lowerRoman"/>
+      <w:lvlText w:val="%6."/>
+      <w:lvlJc w:val="right"/>
+      <w:pPr>
+        <w:ind w:left="4320" w:hanging="180"/>
+      </w:pPr>
+    </w:lvl>
+    <w:lvl w:ilvl="6" w:tplc="FFFFFFFF" w:tentative="1">
+      <w:start w:val="1"/>
+      <w:numFmt w:val="decimal"/>
+      <w:lvlText w:val="%7."/>
+      <w:lvlJc w:val="left"/>
+      <w:pPr>
+        <w:ind w:left="5040" w:hanging="360"/>
+      </w:pPr>
+    </w:lvl>
+    <w:lvl w:ilvl="7" w:tplc="FFFFFFFF" w:tentative="1">
+      <w:start w:val="1"/>
+      <w:numFmt w:val="lowerLetter"/>
+      <w:lvlText w:val="%8."/>
+      <w:lvlJc w:val="left"/>
+      <w:pPr>
+        <w:ind w:left="5760" w:hanging="360"/>
+      </w:pPr>
+    </w:lvl>
+    <w:lvl w:ilvl="8" w:tplc="FFFFFFFF" w:tentative="1">
+      <w:start w:val="1"/>
+      <w:numFmt w:val="lowerRoman"/>
+      <w:lvlText w:val="%9."/>
+      <w:lvlJc w:val="right"/>
+      <w:pPr>
+        <w:ind w:left="6480" w:hanging="180"/>
+      </w:pPr>
+    </w:lvl>
+  </w:abstractNum>
+  <w:abstractNum w:abstractNumId="2" w15:restartNumberingAfterBreak="0">
     <w:nsid w:val="21847F83"/>
     <w:multiLevelType w:val="hybridMultilevel"/>
     <w:tmpl w:val="2A94F804"/>
@@ -23470,7 +25038,7 @@
       </w:pPr>
     </w:lvl>
   </w:abstractNum>
-  <w:abstractNum w:abstractNumId="2" w15:restartNumberingAfterBreak="0">
+  <w:abstractNum w:abstractNumId="3" w15:restartNumberingAfterBreak="0">
     <w:nsid w:val="25027492"/>
     <w:multiLevelType w:val="multilevel"/>
     <w:tmpl w:val="5FBAFB56"/>
@@ -23591,7 +25159,7 @@
       </w:rPr>
     </w:lvl>
   </w:abstractNum>
-  <w:abstractNum w:abstractNumId="3" w15:restartNumberingAfterBreak="0">
+  <w:abstractNum w:abstractNumId="4" w15:restartNumberingAfterBreak="0">
     <w:nsid w:val="28DE7432"/>
     <w:multiLevelType w:val="hybridMultilevel"/>
     <w:tmpl w:val="F70E9820"/>
@@ -23645,7 +25213,7 @@
       <w:lvlJc w:val="left"/>
     </w:lvl>
   </w:abstractNum>
-  <w:abstractNum w:abstractNumId="4" w15:restartNumberingAfterBreak="0">
+  <w:abstractNum w:abstractNumId="5" w15:restartNumberingAfterBreak="0">
     <w:nsid w:val="29211217"/>
     <w:multiLevelType w:val="hybridMultilevel"/>
     <w:tmpl w:val="212AB170"/>
@@ -23731,7 +25299,7 @@
       </w:pPr>
     </w:lvl>
   </w:abstractNum>
-  <w:abstractNum w:abstractNumId="5" w15:restartNumberingAfterBreak="0">
+  <w:abstractNum w:abstractNumId="6" w15:restartNumberingAfterBreak="0">
     <w:nsid w:val="2B9C3DD0"/>
     <w:multiLevelType w:val="hybridMultilevel"/>
     <w:tmpl w:val="B8288E10"/>
@@ -23817,7 +25385,7 @@
       </w:pPr>
     </w:lvl>
   </w:abstractNum>
-  <w:abstractNum w:abstractNumId="6" w15:restartNumberingAfterBreak="0">
+  <w:abstractNum w:abstractNumId="7" w15:restartNumberingAfterBreak="0">
     <w:nsid w:val="313F0CD2"/>
     <w:multiLevelType w:val="hybridMultilevel"/>
     <w:tmpl w:val="5D5C220A"/>
@@ -23895,7 +25463,7 @@
       </w:pPr>
     </w:lvl>
   </w:abstractNum>
-  <w:abstractNum w:abstractNumId="7" w15:restartNumberingAfterBreak="0">
+  <w:abstractNum w:abstractNumId="8" w15:restartNumberingAfterBreak="0">
     <w:nsid w:val="385F6630"/>
     <w:multiLevelType w:val="hybridMultilevel"/>
     <w:tmpl w:val="63A400E4"/>
@@ -23949,7 +25517,7 @@
       <w:lvlJc w:val="left"/>
     </w:lvl>
   </w:abstractNum>
-  <w:abstractNum w:abstractNumId="8" w15:restartNumberingAfterBreak="0">
+  <w:abstractNum w:abstractNumId="9" w15:restartNumberingAfterBreak="0">
     <w:nsid w:val="3DF769A8"/>
     <w:multiLevelType w:val="hybridMultilevel"/>
     <w:tmpl w:val="8EE6AA6C"/>
@@ -24035,7 +25603,7 @@
       </w:pPr>
     </w:lvl>
   </w:abstractNum>
-  <w:abstractNum w:abstractNumId="9" w15:restartNumberingAfterBreak="0">
+  <w:abstractNum w:abstractNumId="10" w15:restartNumberingAfterBreak="0">
     <w:nsid w:val="3F9610E2"/>
     <w:multiLevelType w:val="hybridMultilevel"/>
     <w:tmpl w:val="81622C04"/>
@@ -24148,7 +25716,7 @@
       </w:rPr>
     </w:lvl>
   </w:abstractNum>
-  <w:abstractNum w:abstractNumId="10" w15:restartNumberingAfterBreak="0">
+  <w:abstractNum w:abstractNumId="11" w15:restartNumberingAfterBreak="0">
     <w:nsid w:val="48C2726E"/>
     <w:multiLevelType w:val="hybridMultilevel"/>
     <w:tmpl w:val="20BE861C"/>
@@ -24226,7 +25794,7 @@
       </w:pPr>
     </w:lvl>
   </w:abstractNum>
-  <w:abstractNum w:abstractNumId="11" w15:restartNumberingAfterBreak="0">
+  <w:abstractNum w:abstractNumId="12" w15:restartNumberingAfterBreak="0">
     <w:nsid w:val="4A2D6F9F"/>
     <w:multiLevelType w:val="multilevel"/>
     <w:tmpl w:val="D15EAE7A"/>
@@ -24344,7 +25912,7 @@
       </w:rPr>
     </w:lvl>
   </w:abstractNum>
-  <w:abstractNum w:abstractNumId="12" w15:restartNumberingAfterBreak="0">
+  <w:abstractNum w:abstractNumId="13" w15:restartNumberingAfterBreak="0">
     <w:nsid w:val="4F5B0E28"/>
     <w:multiLevelType w:val="hybridMultilevel"/>
     <w:tmpl w:val="A7084D28"/>
@@ -24430,7 +25998,7 @@
       </w:pPr>
     </w:lvl>
   </w:abstractNum>
-  <w:abstractNum w:abstractNumId="13" w15:restartNumberingAfterBreak="0">
+  <w:abstractNum w:abstractNumId="14" w15:restartNumberingAfterBreak="0">
     <w:nsid w:val="58F621F0"/>
     <w:multiLevelType w:val="hybridMultilevel"/>
     <w:tmpl w:val="4E42C41A"/>
@@ -24484,7 +26052,93 @@
       <w:lvlJc w:val="left"/>
     </w:lvl>
   </w:abstractNum>
-  <w:abstractNum w:abstractNumId="14" w15:restartNumberingAfterBreak="0">
+  <w:abstractNum w:abstractNumId="15" w15:restartNumberingAfterBreak="0">
+    <w:nsid w:val="5FC71208"/>
+    <w:multiLevelType w:val="hybridMultilevel"/>
+    <w:tmpl w:val="05D4DE6E"/>
+    <w:lvl w:ilvl="0" w:tplc="FFFFFFFF">
+      <w:start w:val="1"/>
+      <w:numFmt w:val="decimal"/>
+      <w:lvlText w:val="%1."/>
+      <w:lvlJc w:val="left"/>
+      <w:pPr>
+        <w:ind w:left="720" w:hanging="360"/>
+      </w:pPr>
+    </w:lvl>
+    <w:lvl w:ilvl="1" w:tplc="FFFFFFFF">
+      <w:start w:val="1"/>
+      <w:numFmt w:val="lowerLetter"/>
+      <w:lvlText w:val="%2."/>
+      <w:lvlJc w:val="left"/>
+      <w:pPr>
+        <w:ind w:left="1440" w:hanging="360"/>
+      </w:pPr>
+    </w:lvl>
+    <w:lvl w:ilvl="2" w:tplc="FFFFFFFF" w:tentative="1">
+      <w:start w:val="1"/>
+      <w:numFmt w:val="lowerRoman"/>
+      <w:lvlText w:val="%3."/>
+      <w:lvlJc w:val="right"/>
+      <w:pPr>
+        <w:ind w:left="2160" w:hanging="180"/>
+      </w:pPr>
+    </w:lvl>
+    <w:lvl w:ilvl="3" w:tplc="FFFFFFFF" w:tentative="1">
+      <w:start w:val="1"/>
+      <w:numFmt w:val="decimal"/>
+      <w:lvlText w:val="%4."/>
+      <w:lvlJc w:val="left"/>
+      <w:pPr>
+        <w:ind w:left="2880" w:hanging="360"/>
+      </w:pPr>
+    </w:lvl>
+    <w:lvl w:ilvl="4" w:tplc="FFFFFFFF" w:tentative="1">
+      <w:start w:val="1"/>
+      <w:numFmt w:val="lowerLetter"/>
+      <w:lvlText w:val="%5."/>
+      <w:lvlJc w:val="left"/>
+      <w:pPr>
+        <w:ind w:left="3600" w:hanging="360"/>
+      </w:pPr>
+    </w:lvl>
+    <w:lvl w:ilvl="5" w:tplc="FFFFFFFF" w:tentative="1">
+      <w:start w:val="1"/>
+      <w:numFmt w:val="lowerRoman"/>
+      <w:lvlText w:val="%6."/>
+      <w:lvlJc w:val="right"/>
+      <w:pPr>
+        <w:ind w:left="4320" w:hanging="180"/>
+      </w:pPr>
+    </w:lvl>
+    <w:lvl w:ilvl="6" w:tplc="FFFFFFFF" w:tentative="1">
+      <w:start w:val="1"/>
+      <w:numFmt w:val="decimal"/>
+      <w:lvlText w:val="%7."/>
+      <w:lvlJc w:val="left"/>
+      <w:pPr>
+        <w:ind w:left="5040" w:hanging="360"/>
+      </w:pPr>
+    </w:lvl>
+    <w:lvl w:ilvl="7" w:tplc="FFFFFFFF" w:tentative="1">
+      <w:start w:val="1"/>
+      <w:numFmt w:val="lowerLetter"/>
+      <w:lvlText w:val="%8."/>
+      <w:lvlJc w:val="left"/>
+      <w:pPr>
+        <w:ind w:left="5760" w:hanging="360"/>
+      </w:pPr>
+    </w:lvl>
+    <w:lvl w:ilvl="8" w:tplc="FFFFFFFF" w:tentative="1">
+      <w:start w:val="1"/>
+      <w:numFmt w:val="lowerRoman"/>
+      <w:lvlText w:val="%9."/>
+      <w:lvlJc w:val="right"/>
+      <w:pPr>
+        <w:ind w:left="6480" w:hanging="180"/>
+      </w:pPr>
+    </w:lvl>
+  </w:abstractNum>
+  <w:abstractNum w:abstractNumId="16" w15:restartNumberingAfterBreak="0">
     <w:nsid w:val="6397743C"/>
     <w:multiLevelType w:val="hybridMultilevel"/>
     <w:tmpl w:val="E1727A4C"/>
@@ -24597,7 +26251,7 @@
       </w:rPr>
     </w:lvl>
   </w:abstractNum>
-  <w:abstractNum w:abstractNumId="15" w15:restartNumberingAfterBreak="0">
+  <w:abstractNum w:abstractNumId="17" w15:restartNumberingAfterBreak="0">
     <w:nsid w:val="64C9529E"/>
     <w:multiLevelType w:val="hybridMultilevel"/>
     <w:tmpl w:val="4404A70E"/>
@@ -24683,7 +26337,7 @@
       </w:pPr>
     </w:lvl>
   </w:abstractNum>
-  <w:abstractNum w:abstractNumId="16" w15:restartNumberingAfterBreak="0">
+  <w:abstractNum w:abstractNumId="18" w15:restartNumberingAfterBreak="0">
     <w:nsid w:val="6BF67BCA"/>
     <w:multiLevelType w:val="hybridMultilevel"/>
     <w:tmpl w:val="A9247D98"/>
@@ -24769,7 +26423,93 @@
       </w:pPr>
     </w:lvl>
   </w:abstractNum>
-  <w:abstractNum w:abstractNumId="17" w15:restartNumberingAfterBreak="0">
+  <w:abstractNum w:abstractNumId="19" w15:restartNumberingAfterBreak="0">
+    <w:nsid w:val="6C722CF0"/>
+    <w:multiLevelType w:val="hybridMultilevel"/>
+    <w:tmpl w:val="05D4DE6E"/>
+    <w:lvl w:ilvl="0" w:tplc="FFFFFFFF">
+      <w:start w:val="1"/>
+      <w:numFmt w:val="decimal"/>
+      <w:lvlText w:val="%1."/>
+      <w:lvlJc w:val="left"/>
+      <w:pPr>
+        <w:ind w:left="720" w:hanging="360"/>
+      </w:pPr>
+    </w:lvl>
+    <w:lvl w:ilvl="1" w:tplc="FFFFFFFF">
+      <w:start w:val="1"/>
+      <w:numFmt w:val="lowerLetter"/>
+      <w:lvlText w:val="%2."/>
+      <w:lvlJc w:val="left"/>
+      <w:pPr>
+        <w:ind w:left="1440" w:hanging="360"/>
+      </w:pPr>
+    </w:lvl>
+    <w:lvl w:ilvl="2" w:tplc="FFFFFFFF" w:tentative="1">
+      <w:start w:val="1"/>
+      <w:numFmt w:val="lowerRoman"/>
+      <w:lvlText w:val="%3."/>
+      <w:lvlJc w:val="right"/>
+      <w:pPr>
+        <w:ind w:left="2160" w:hanging="180"/>
+      </w:pPr>
+    </w:lvl>
+    <w:lvl w:ilvl="3" w:tplc="FFFFFFFF" w:tentative="1">
+      <w:start w:val="1"/>
+      <w:numFmt w:val="decimal"/>
+      <w:lvlText w:val="%4."/>
+      <w:lvlJc w:val="left"/>
+      <w:pPr>
+        <w:ind w:left="2880" w:hanging="360"/>
+      </w:pPr>
+    </w:lvl>
+    <w:lvl w:ilvl="4" w:tplc="FFFFFFFF" w:tentative="1">
+      <w:start w:val="1"/>
+      <w:numFmt w:val="lowerLetter"/>
+      <w:lvlText w:val="%5."/>
+      <w:lvlJc w:val="left"/>
+      <w:pPr>
+        <w:ind w:left="3600" w:hanging="360"/>
+      </w:pPr>
+    </w:lvl>
+    <w:lvl w:ilvl="5" w:tplc="FFFFFFFF" w:tentative="1">
+      <w:start w:val="1"/>
+      <w:numFmt w:val="lowerRoman"/>
+      <w:lvlText w:val="%6."/>
+      <w:lvlJc w:val="right"/>
+      <w:pPr>
+        <w:ind w:left="4320" w:hanging="180"/>
+      </w:pPr>
+    </w:lvl>
+    <w:lvl w:ilvl="6" w:tplc="FFFFFFFF" w:tentative="1">
+      <w:start w:val="1"/>
+      <w:numFmt w:val="decimal"/>
+      <w:lvlText w:val="%7."/>
+      <w:lvlJc w:val="left"/>
+      <w:pPr>
+        <w:ind w:left="5040" w:hanging="360"/>
+      </w:pPr>
+    </w:lvl>
+    <w:lvl w:ilvl="7" w:tplc="FFFFFFFF" w:tentative="1">
+      <w:start w:val="1"/>
+      <w:numFmt w:val="lowerLetter"/>
+      <w:lvlText w:val="%8."/>
+      <w:lvlJc w:val="left"/>
+      <w:pPr>
+        <w:ind w:left="5760" w:hanging="360"/>
+      </w:pPr>
+    </w:lvl>
+    <w:lvl w:ilvl="8" w:tplc="FFFFFFFF" w:tentative="1">
+      <w:start w:val="1"/>
+      <w:numFmt w:val="lowerRoman"/>
+      <w:lvlText w:val="%9."/>
+      <w:lvlJc w:val="right"/>
+      <w:pPr>
+        <w:ind w:left="6480" w:hanging="180"/>
+      </w:pPr>
+    </w:lvl>
+  </w:abstractNum>
+  <w:abstractNum w:abstractNumId="20" w15:restartNumberingAfterBreak="0">
     <w:nsid w:val="76A2720B"/>
     <w:multiLevelType w:val="multilevel"/>
     <w:tmpl w:val="47305186"/>
@@ -24887,7 +26627,7 @@
       </w:rPr>
     </w:lvl>
   </w:abstractNum>
-  <w:abstractNum w:abstractNumId="18" w15:restartNumberingAfterBreak="0">
+  <w:abstractNum w:abstractNumId="21" w15:restartNumberingAfterBreak="0">
     <w:nsid w:val="79FB6317"/>
     <w:multiLevelType w:val="hybridMultilevel"/>
     <w:tmpl w:val="05D4DE6E"/>
@@ -24973,7 +26713,7 @@
       </w:pPr>
     </w:lvl>
   </w:abstractNum>
-  <w:abstractNum w:abstractNumId="19" w15:restartNumberingAfterBreak="0">
+  <w:abstractNum w:abstractNumId="22" w15:restartNumberingAfterBreak="0">
     <w:nsid w:val="7A304540"/>
     <w:multiLevelType w:val="hybridMultilevel"/>
     <w:tmpl w:val="05D4DE6E"/>
@@ -25060,79 +26800,97 @@
     </w:lvl>
   </w:abstractNum>
   <w:num w:numId="1" w16cid:durableId="98918231">
-    <w:abstractNumId w:val="14"/>
+    <w:abstractNumId w:val="16"/>
   </w:num>
   <w:num w:numId="2" w16cid:durableId="1625428884">
-    <w:abstractNumId w:val="6"/>
+    <w:abstractNumId w:val="7"/>
   </w:num>
   <w:num w:numId="3" w16cid:durableId="145096842">
-    <w:abstractNumId w:val="6"/>
+    <w:abstractNumId w:val="7"/>
   </w:num>
   <w:num w:numId="4" w16cid:durableId="1010303521">
-    <w:abstractNumId w:val="1"/>
+    <w:abstractNumId w:val="2"/>
   </w:num>
   <w:num w:numId="5" w16cid:durableId="1586300552">
-    <w:abstractNumId w:val="10"/>
+    <w:abstractNumId w:val="11"/>
   </w:num>
   <w:num w:numId="6" w16cid:durableId="286741144">
-    <w:abstractNumId w:val="10"/>
+    <w:abstractNumId w:val="11"/>
   </w:num>
   <w:num w:numId="7" w16cid:durableId="140075544">
-    <w:abstractNumId w:val="18"/>
+    <w:abstractNumId w:val="21"/>
   </w:num>
   <w:num w:numId="8" w16cid:durableId="1648047030">
     <w:abstractNumId w:val="0"/>
   </w:num>
   <w:num w:numId="9" w16cid:durableId="1403681582">
-    <w:abstractNumId w:val="17"/>
+    <w:abstractNumId w:val="20"/>
   </w:num>
   <w:num w:numId="10" w16cid:durableId="401176546">
-    <w:abstractNumId w:val="8"/>
+    <w:abstractNumId w:val="9"/>
   </w:num>
   <w:num w:numId="11" w16cid:durableId="2113355635">
-    <w:abstractNumId w:val="16"/>
+    <w:abstractNumId w:val="18"/>
   </w:num>
   <w:num w:numId="12" w16cid:durableId="1284732426">
-    <w:abstractNumId w:val="9"/>
+    <w:abstractNumId w:val="10"/>
   </w:num>
   <w:num w:numId="13" w16cid:durableId="1554807601">
+    <w:abstractNumId w:val="13"/>
+  </w:num>
+  <w:num w:numId="14" w16cid:durableId="1608731391">
     <w:abstractNumId w:val="12"/>
   </w:num>
-  <w:num w:numId="14" w16cid:durableId="1608731391">
-    <w:abstractNumId w:val="11"/>
-  </w:num>
   <w:num w:numId="15" w16cid:durableId="1281570453">
-    <w:abstractNumId w:val="2"/>
+    <w:abstractNumId w:val="3"/>
   </w:num>
   <w:num w:numId="16" w16cid:durableId="244002322">
-    <w:abstractNumId w:val="13"/>
+    <w:abstractNumId w:val="14"/>
     <w:lvlOverride w:ilvl="0">
       <w:startOverride w:val="1"/>
     </w:lvlOverride>
   </w:num>
   <w:num w:numId="17" w16cid:durableId="630014125">
-    <w:abstractNumId w:val="7"/>
+    <w:abstractNumId w:val="8"/>
   </w:num>
   <w:num w:numId="18" w16cid:durableId="630330907">
+    <w:abstractNumId w:val="6"/>
+  </w:num>
+  <w:num w:numId="19" w16cid:durableId="993995603">
+    <w:abstractNumId w:val="17"/>
+  </w:num>
+  <w:num w:numId="20" w16cid:durableId="1361737721">
+    <w:abstractNumId w:val="8"/>
+  </w:num>
+  <w:num w:numId="21" w16cid:durableId="1676029381">
     <w:abstractNumId w:val="5"/>
   </w:num>
-  <w:num w:numId="19" w16cid:durableId="993995603">
-    <w:abstractNumId w:val="15"/>
-  </w:num>
-  <w:num w:numId="20" w16cid:durableId="1361737721">
-    <w:abstractNumId w:val="7"/>
-  </w:num>
-  <w:num w:numId="21" w16cid:durableId="1676029381">
-    <w:abstractNumId w:val="4"/>
-  </w:num>
   <w:num w:numId="22" w16cid:durableId="1938437933">
-    <w:abstractNumId w:val="19"/>
+    <w:abstractNumId w:val="22"/>
   </w:num>
   <w:num w:numId="23" w16cid:durableId="1568223358">
-    <w:abstractNumId w:val="3"/>
+    <w:abstractNumId w:val="4"/>
     <w:lvlOverride w:ilvl="0">
       <w:startOverride w:val="1"/>
     </w:lvlOverride>
+  </w:num>
+  <w:num w:numId="24" w16cid:durableId="1723366325">
+    <w:abstractNumId w:val="22"/>
+  </w:num>
+  <w:num w:numId="25" w16cid:durableId="889193096">
+    <w:abstractNumId w:val="22"/>
+  </w:num>
+  <w:num w:numId="26" w16cid:durableId="1874927172">
+    <w:abstractNumId w:val="22"/>
+  </w:num>
+  <w:num w:numId="27" w16cid:durableId="2006399222">
+    <w:abstractNumId w:val="1"/>
+  </w:num>
+  <w:num w:numId="28" w16cid:durableId="2010862953">
+    <w:abstractNumId w:val="15"/>
+  </w:num>
+  <w:num w:numId="29" w16cid:durableId="827870213">
+    <w:abstractNumId w:val="19"/>
   </w:num>
 </w:numbering>
 </file>
@@ -25767,6 +27525,7 @@
   <w:style w:type="character" w:default="1" w:styleId="DefaultParagraphFont">
     <w:name w:val="Default Paragraph Font"/>
     <w:uiPriority w:val="1"/>
+    <w:semiHidden/>
     <w:unhideWhenUsed/>
   </w:style>
   <w:style w:type="table" w:default="1" w:styleId="TableNormal">

</xml_diff>